<commit_message>
Actualizacion de Control de Cambios
</commit_message>
<xml_diff>
--- a/Documentacion/11 Matriz de Calidad.docx
+++ b/Documentacion/11 Matriz de Calidad.docx
@@ -1180,6 +1180,19 @@
             <w:hideMark/>
           </w:tcPr>
           <w:p>
+            <w:r>
+              <w:t>1.1.0</w:t>
+            </w:r>
+          </w:p>
+        </w:tc>
+      </w:tr>
+      <w:tr>
+        <w:tc>
+          <w:tcPr>
+            <w:tcW w:w="0" w:type="auto"/>
+            <w:hideMark/>
+          </w:tcPr>
+          <w:p>
             <w:pPr>
               <w:pStyle w:val="TDC1"/>
               <w:spacing w:line="276" w:lineRule="auto"/>
@@ -1199,12 +1212,10 @@
                 <w:sz w:val="22"/>
                 <w:szCs w:val="22"/>
               </w:rPr>
-              <w:t>1.0.0</w:t>
-            </w:r>
-          </w:p>
-        </w:tc>
-      </w:tr>
-      <w:tr>
+              <w:t>Estado</w:t>
+            </w:r>
+          </w:p>
+        </w:tc>
         <w:tc>
           <w:tcPr>
             <w:tcW w:w="0" w:type="auto"/>
@@ -1230,10 +1241,12 @@
                 <w:sz w:val="22"/>
                 <w:szCs w:val="22"/>
               </w:rPr>
-              <w:t>Estado</w:t>
-            </w:r>
-          </w:p>
-        </w:tc>
+              <w:t>En elaboración</w:t>
+            </w:r>
+          </w:p>
+        </w:tc>
+      </w:tr>
+      <w:tr>
         <w:tc>
           <w:tcPr>
             <w:tcW w:w="0" w:type="auto"/>
@@ -1259,12 +1272,10 @@
                 <w:sz w:val="22"/>
                 <w:szCs w:val="22"/>
               </w:rPr>
-              <w:t>En elaboración</w:t>
-            </w:r>
-          </w:p>
-        </w:tc>
-      </w:tr>
-      <w:tr>
+              <w:t>Fecha de creación</w:t>
+            </w:r>
+          </w:p>
+        </w:tc>
         <w:tc>
           <w:tcPr>
             <w:tcW w:w="0" w:type="auto"/>
@@ -1290,10 +1301,12 @@
                 <w:sz w:val="22"/>
                 <w:szCs w:val="22"/>
               </w:rPr>
-              <w:t>Fecha de creación</w:t>
-            </w:r>
-          </w:p>
-        </w:tc>
+              <w:t>06/09/2026</w:t>
+            </w:r>
+          </w:p>
+        </w:tc>
+      </w:tr>
+      <w:tr>
         <w:tc>
           <w:tcPr>
             <w:tcW w:w="0" w:type="auto"/>
@@ -1319,67 +1332,18 @@
                 <w:sz w:val="22"/>
                 <w:szCs w:val="22"/>
               </w:rPr>
-              <w:t>06/09/2026</w:t>
-            </w:r>
-          </w:p>
-        </w:tc>
-      </w:tr>
-      <w:tr>
+              <w:t>Fecha de actualización</w:t>
+            </w:r>
+          </w:p>
+        </w:tc>
         <w:tc>
           <w:tcPr>
             <w:tcW w:w="0" w:type="auto"/>
             <w:hideMark/>
           </w:tcPr>
           <w:p>
-            <w:pPr>
-              <w:pStyle w:val="TDC1"/>
-              <w:spacing w:line="276" w:lineRule="auto"/>
-              <w:rPr>
-                <w:b w:val="0"/>
-                <w:bCs w:val="0"/>
-                <w:color w:val="000000" w:themeColor="text1"/>
-                <w:sz w:val="22"/>
-                <w:szCs w:val="22"/>
-              </w:rPr>
-            </w:pPr>
-            <w:r>
-              <w:rPr>
-                <w:b w:val="0"/>
-                <w:bCs w:val="0"/>
-                <w:color w:val="000000" w:themeColor="text1"/>
-                <w:sz w:val="22"/>
-                <w:szCs w:val="22"/>
-              </w:rPr>
-              <w:t>Fecha de actualización</w:t>
-            </w:r>
-          </w:p>
-        </w:tc>
-        <w:tc>
-          <w:tcPr>
-            <w:tcW w:w="0" w:type="auto"/>
-            <w:hideMark/>
-          </w:tcPr>
-          <w:p>
-            <w:pPr>
-              <w:pStyle w:val="TDC1"/>
-              <w:spacing w:line="276" w:lineRule="auto"/>
-              <w:rPr>
-                <w:b w:val="0"/>
-                <w:bCs w:val="0"/>
-                <w:color w:val="000000" w:themeColor="text1"/>
-                <w:sz w:val="22"/>
-                <w:szCs w:val="22"/>
-              </w:rPr>
-            </w:pPr>
-            <w:r>
-              <w:rPr>
-                <w:b w:val="0"/>
-                <w:bCs w:val="0"/>
-                <w:color w:val="000000" w:themeColor="text1"/>
-                <w:sz w:val="22"/>
-                <w:szCs w:val="22"/>
-              </w:rPr>
-              <w:t>14/09/2026</w:t>
+            <w:r>
+              <w:t>19/09/2026</w:t>
             </w:r>
           </w:p>
         </w:tc>
@@ -2288,15 +2252,18 @@
         <w:tc>
           <w:tcPr>
             <w:tcW w:w="0" w:type="auto"/>
-            <w:hideMark/>
-          </w:tcPr>
-          <w:p>
-            <w:pPr>
-              <w:spacing w:line="276" w:lineRule="auto"/>
+            <w:shd w:val="clear" w:color="auto" w:fill="943634" w:themeFill="accent2" w:themeFillShade="BF"/>
+            <w:hideMark/>
+          </w:tcPr>
+          <w:p>
+            <w:pPr>
+              <w:spacing w:line="276" w:lineRule="auto"/>
+              <w:jc w:val="center"/>
               <w:rPr>
                 <w:rFonts w:ascii="Verdana" w:hAnsi="Verdana"/>
                 <w:b/>
                 <w:bCs/>
+                <w:color w:val="FFFFFF" w:themeColor="background1"/>
                 <w:lang w:val="es-EC"/>
               </w:rPr>
             </w:pPr>
@@ -2305,6 +2272,7 @@
                 <w:rFonts w:ascii="Verdana" w:hAnsi="Verdana"/>
                 <w:b/>
                 <w:bCs/>
+                <w:color w:val="FFFFFF" w:themeColor="background1"/>
                 <w:lang w:val="es-EC"/>
               </w:rPr>
               <w:t>Versión</w:t>
@@ -2314,15 +2282,18 @@
         <w:tc>
           <w:tcPr>
             <w:tcW w:w="0" w:type="auto"/>
-            <w:hideMark/>
-          </w:tcPr>
-          <w:p>
-            <w:pPr>
-              <w:spacing w:line="276" w:lineRule="auto"/>
+            <w:shd w:val="clear" w:color="auto" w:fill="943634" w:themeFill="accent2" w:themeFillShade="BF"/>
+            <w:hideMark/>
+          </w:tcPr>
+          <w:p>
+            <w:pPr>
+              <w:spacing w:line="276" w:lineRule="auto"/>
+              <w:jc w:val="center"/>
               <w:rPr>
                 <w:rFonts w:ascii="Verdana" w:hAnsi="Verdana"/>
                 <w:b/>
                 <w:bCs/>
+                <w:color w:val="FFFFFF" w:themeColor="background1"/>
                 <w:lang w:val="es-EC"/>
               </w:rPr>
             </w:pPr>
@@ -2331,6 +2302,7 @@
                 <w:rFonts w:ascii="Verdana" w:hAnsi="Verdana"/>
                 <w:b/>
                 <w:bCs/>
+                <w:color w:val="FFFFFF" w:themeColor="background1"/>
                 <w:lang w:val="es-EC"/>
               </w:rPr>
               <w:t>Fecha</w:t>
@@ -2340,15 +2312,18 @@
         <w:tc>
           <w:tcPr>
             <w:tcW w:w="0" w:type="auto"/>
-            <w:hideMark/>
-          </w:tcPr>
-          <w:p>
-            <w:pPr>
-              <w:spacing w:line="276" w:lineRule="auto"/>
+            <w:shd w:val="clear" w:color="auto" w:fill="943634" w:themeFill="accent2" w:themeFillShade="BF"/>
+            <w:hideMark/>
+          </w:tcPr>
+          <w:p>
+            <w:pPr>
+              <w:spacing w:line="276" w:lineRule="auto"/>
+              <w:jc w:val="center"/>
               <w:rPr>
                 <w:rFonts w:ascii="Verdana" w:hAnsi="Verdana"/>
                 <w:b/>
                 <w:bCs/>
+                <w:color w:val="FFFFFF" w:themeColor="background1"/>
                 <w:lang w:val="es-EC"/>
               </w:rPr>
             </w:pPr>
@@ -2357,6 +2332,7 @@
                 <w:rFonts w:ascii="Verdana" w:hAnsi="Verdana"/>
                 <w:b/>
                 <w:bCs/>
+                <w:color w:val="FFFFFF" w:themeColor="background1"/>
                 <w:lang w:val="es-EC"/>
               </w:rPr>
               <w:t>Actividad realizada</w:t>
@@ -2366,15 +2342,18 @@
         <w:tc>
           <w:tcPr>
             <w:tcW w:w="0" w:type="auto"/>
-            <w:hideMark/>
-          </w:tcPr>
-          <w:p>
-            <w:pPr>
-              <w:spacing w:line="276" w:lineRule="auto"/>
+            <w:shd w:val="clear" w:color="auto" w:fill="943634" w:themeFill="accent2" w:themeFillShade="BF"/>
+            <w:hideMark/>
+          </w:tcPr>
+          <w:p>
+            <w:pPr>
+              <w:spacing w:line="276" w:lineRule="auto"/>
+              <w:jc w:val="center"/>
               <w:rPr>
                 <w:rFonts w:ascii="Verdana" w:hAnsi="Verdana"/>
                 <w:b/>
                 <w:bCs/>
+                <w:color w:val="FFFFFF" w:themeColor="background1"/>
                 <w:lang w:val="es-EC"/>
               </w:rPr>
             </w:pPr>
@@ -2383,6 +2362,7 @@
                 <w:rFonts w:ascii="Verdana" w:hAnsi="Verdana"/>
                 <w:b/>
                 <w:bCs/>
+                <w:color w:val="FFFFFF" w:themeColor="background1"/>
                 <w:lang w:val="es-EC"/>
               </w:rPr>
               <w:t>Responsable</w:t>
@@ -3079,14 +3059,7 @@
                 <w:rFonts w:ascii="Verdana" w:hAnsi="Verdana"/>
                 <w:lang w:val="es-EC"/>
               </w:rPr>
-              <w:t>A</w:t>
-            </w:r>
-            <w:r>
-              <w:rPr>
-                <w:rFonts w:ascii="Verdana" w:hAnsi="Verdana"/>
-                <w:lang w:val="es-EC"/>
-              </w:rPr>
-              <w:t xml:space="preserve">lex Mendoza </w:t>
+              <w:t xml:space="preserve">Alex Mendoza </w:t>
             </w:r>
           </w:p>
         </w:tc>
@@ -3282,6 +3255,94 @@
                 <w:rFonts w:ascii="Verdana" w:hAnsi="Verdana"/>
                 <w:lang w:val="es-EC"/>
               </w:rPr>
+              <w:t>Luis Rodríguez</w:t>
+            </w:r>
+          </w:p>
+        </w:tc>
+      </w:tr>
+      <w:tr>
+        <w:tc>
+          <w:tcPr>
+            <w:tcW w:w="1153" w:type="dxa"/>
+          </w:tcPr>
+          <w:p>
+            <w:pPr>
+              <w:rPr>
+                <w:rFonts w:ascii="Verdana" w:hAnsi="Verdana"/>
+              </w:rPr>
+            </w:pPr>
+            <w:r>
+              <w:rPr>
+                <w:rFonts w:ascii="Verdana" w:hAnsi="Verdana"/>
+                <w:color w:val="000000"/>
+              </w:rPr>
+              <w:t>1.1.0</w:t>
+            </w:r>
+          </w:p>
+        </w:tc>
+        <w:tc>
+          <w:tcPr>
+            <w:tcW w:w="1535" w:type="dxa"/>
+          </w:tcPr>
+          <w:p>
+            <w:pPr>
+              <w:rPr>
+                <w:rFonts w:ascii="Verdana" w:hAnsi="Verdana"/>
+              </w:rPr>
+            </w:pPr>
+            <w:r>
+              <w:rPr>
+                <w:rFonts w:ascii="Verdana" w:hAnsi="Verdana"/>
+                <w:color w:val="000000"/>
+              </w:rPr>
+              <w:t>19/09/2026</w:t>
+            </w:r>
+          </w:p>
+        </w:tc>
+        <w:tc>
+          <w:tcPr>
+            <w:tcW w:w="4959" w:type="dxa"/>
+          </w:tcPr>
+          <w:p>
+            <w:pPr>
+              <w:rPr>
+                <w:rFonts w:ascii="Verdana" w:hAnsi="Verdana"/>
+                <w:lang w:val="es-EC"/>
+              </w:rPr>
+            </w:pPr>
+            <w:r>
+              <w:rPr>
+                <w:rFonts w:ascii="Verdana" w:hAnsi="Verdana"/>
+                <w:color w:val="000000"/>
+                <w:lang w:val="es-EC"/>
+              </w:rPr>
+              <w:t>Incorporación de métricas de calidad con las columnas recomendadas: qué queremos medir, objetivo del proyecto, métrica, meta, fuente de datos y proceso.</w:t>
+            </w:r>
+          </w:p>
+        </w:tc>
+        <w:tc>
+          <w:tcPr>
+            <w:tcW w:w="1929" w:type="dxa"/>
+          </w:tcPr>
+          <w:p>
+            <w:pPr>
+              <w:rPr>
+                <w:rFonts w:ascii="Verdana" w:hAnsi="Verdana"/>
+              </w:rPr>
+            </w:pPr>
+            <w:r>
+              <w:rPr>
+                <w:rFonts w:ascii="Verdana" w:hAnsi="Verdana"/>
+                <w:color w:val="000000"/>
+              </w:rPr>
+              <w:t>Alex Mendoza</w:t>
+            </w:r>
+            <w:r>
+              <w:rPr>
+                <w:rFonts w:ascii="Verdana" w:hAnsi="Verdana"/>
+                <w:color w:val="000000"/>
+              </w:rPr>
+              <w:br/>
               <w:t>Luis Rodríguez</w:t>
             </w:r>
           </w:p>
@@ -5629,7 +5690,7 @@
             <w:sz w:val="22"/>
             <w:szCs w:val="22"/>
           </w:rPr>
-          <w:t>19</w:t>
+          <w:t>21</w:t>
         </w:r>
         <w:r>
           <w:rPr>
@@ -5645,6 +5706,66 @@
           <w:fldChar w:fldCharType="end"/>
         </w:r>
       </w:hyperlink>
+    </w:p>
+    <w:p>
+      <w:pPr>
+        <w:pStyle w:val="TDC2"/>
+        <w:tabs>
+          <w:tab w:val="left" w:pos="880"/>
+          <w:tab w:val="right" w:leader="dot" w:pos="9350"/>
+        </w:tabs>
+        <w:spacing w:before="0"/>
+        <w:rPr>
+          <w:rFonts w:ascii="Verdana" w:hAnsi="Verdana"/>
+          <w:b w:val="0"/>
+          <w:bCs w:val="0"/>
+          <w:noProof/>
+          <w:color w:val="000000" w:themeColor="text1"/>
+          <w:kern w:val="2"/>
+          <w:sz w:val="22"/>
+          <w:szCs w:val="22"/>
+          <w:lang w:val="es-EC" w:eastAsia="es-EC"/>
+          <w14:ligatures w14:val="standardContextual"/>
+        </w:rPr>
+      </w:pPr>
+      <w:r>
+        <w:rPr>
+          <w:rFonts w:ascii="Verdana" w:hAnsi="Verdana"/>
+          <w:b w:val="0"/>
+          <w:bCs w:val="0"/>
+          <w:noProof/>
+          <w:sz w:val="22"/>
+          <w:szCs w:val="22"/>
+          <w:lang w:val="es-EC"/>
+        </w:rPr>
+        <w:t>3.8.</w:t>
+      </w:r>
+      <w:r>
+        <w:rPr>
+          <w:rFonts w:ascii="Verdana" w:hAnsi="Verdana"/>
+          <w:b w:val="0"/>
+          <w:bCs w:val="0"/>
+          <w:noProof/>
+          <w:sz w:val="22"/>
+          <w:szCs w:val="22"/>
+          <w:lang w:val="es-EC"/>
+        </w:rPr>
+        <w:tab/>
+        <w:t>Métricas de calidad del MVP</w:t>
+      </w:r>
+      <w:r>
+        <w:rPr>
+          <w:rFonts w:ascii="Verdana" w:hAnsi="Verdana"/>
+          <w:b w:val="0"/>
+          <w:bCs w:val="0"/>
+          <w:noProof/>
+          <w:sz w:val="22"/>
+          <w:szCs w:val="22"/>
+          <w:lang w:val="es-EC"/>
+        </w:rPr>
+        <w:tab/>
+        <w:t>23</w:t>
+      </w:r>
     </w:p>
     <w:p>
       <w:pPr>
@@ -5774,7 +5895,7 @@
             <w:sz w:val="22"/>
             <w:szCs w:val="22"/>
           </w:rPr>
-          <w:t>21</w:t>
+          <w:t>24</w:t>
         </w:r>
         <w:r>
           <w:rPr>
@@ -5918,7 +6039,7 @@
             <w:sz w:val="22"/>
             <w:szCs w:val="22"/>
           </w:rPr>
-          <w:t>21</w:t>
+          <w:t>24</w:t>
         </w:r>
         <w:r>
           <w:rPr>
@@ -6042,6 +6163,13 @@
           <w:lang w:val="es-EC"/>
         </w:rPr>
         <w:t>La presente matriz define los controles de calidad aplicables al MVP de Barrio Solidario. Su propósito es verificar que la documentación, el diseño visual y el incremento funcional cumplan los requisitos establecidos para el Sprint 3, especialmente en los siguientes componentes:</w:t>
+      </w:r>
+      <w:r>
+        <w:rPr>
+          <w:rFonts w:ascii="Arial" w:hAnsi="Arial"/>
+          <w:lang w:val="es-EC"/>
+        </w:rPr>
+        <w:t xml:space="preserve"> Además de los controles operativos, el documento consolida métricas de proyecto para evaluar el cronograma, el alcance, las pruebas, la seguridad, la accesibilidad, la trazabilidad y la aceptación de los entregables.</w:t>
       </w:r>
     </w:p>
     <w:p>
@@ -19332,7 +19460,6 @@
           <w:lang w:val="es-EC"/>
         </w:rPr>
       </w:pPr>
-      <w:bookmarkStart w:id="13" w:name="_Toc240284867"/>
       <w:r>
         <w:rPr>
           <w:rFonts w:ascii="Verdana" w:hAnsi="Verdana"/>
@@ -19343,7 +19470,6 @@
         </w:rPr>
         <w:t>Gestión, documentación y trazabilidad</w:t>
       </w:r>
-      <w:bookmarkEnd w:id="13"/>
     </w:p>
     <w:tbl>
       <w:tblPr>
@@ -21283,6 +21409,2927 @@
               </w:rPr>
               <w:t>Pendiente</w:t>
             </w:r>
+          </w:p>
+        </w:tc>
+      </w:tr>
+    </w:tbl>
+    <w:p>
+      <w:pPr>
+        <w:pStyle w:val="Ttulo2"/>
+        <w:pageBreakBefore/>
+        <w:numPr>
+          <w:ilvl w:val="1"/>
+          <w:numId w:val="45"/>
+        </w:numPr>
+        <w:spacing w:before="120" w:after="120"/>
+        <w:ind w:left="1134" w:hanging="1134"/>
+        <w:rPr>
+          <w:rFonts w:ascii="Verdana" w:hAnsi="Verdana"/>
+          <w:color w:val="943634" w:themeColor="accent2" w:themeShade="BF"/>
+          <w:sz w:val="32"/>
+          <w:szCs w:val="32"/>
+          <w:lang w:val="es-EC"/>
+        </w:rPr>
+      </w:pPr>
+      <w:bookmarkStart w:id="13" w:name="_Toc240284867"/>
+      <w:bookmarkEnd w:id="13"/>
+      <w:r>
+        <w:rPr>
+          <w:rFonts w:ascii="Verdana" w:hAnsi="Verdana"/>
+          <w:color w:val="943634" w:themeColor="accent2" w:themeShade="BF"/>
+          <w:sz w:val="32"/>
+          <w:szCs w:val="32"/>
+        </w:rPr>
+        <w:lastRenderedPageBreak/>
+        <w:t>Métricas de calidad del MVP</w:t>
+      </w:r>
+    </w:p>
+    <w:p>
+      <w:pPr>
+        <w:keepNext/>
+        <w:spacing w:after="120"/>
+        <w:rPr>
+          <w:lang w:val="es-EC"/>
+        </w:rPr>
+      </w:pPr>
+      <w:r>
+        <w:rPr>
+          <w:rFonts w:ascii="Arial" w:hAnsi="Arial"/>
+          <w:sz w:val="20"/>
+          <w:lang w:val="es-EC"/>
+        </w:rPr>
+        <w:t>Las siguientes métricas complementan los criterios detallados de la matriz y permiten medir el desempeño del proyecto y la calidad del MVP. Cada resultado deberá sustentarse en la fuente indicada y verificarse dentro del proceso correspondiente.</w:t>
+      </w:r>
+    </w:p>
+    <w:tbl>
+      <w:tblPr>
+        <w:tblStyle w:val="Tablaconcuadrcula"/>
+        <w:tblW w:w="13433" w:type="dxa"/>
+        <w:tblLayout w:type="fixed"/>
+        <w:tblLook w:val="04A0" w:firstRow="1" w:lastRow="0" w:firstColumn="1" w:lastColumn="0" w:noHBand="0" w:noVBand="1"/>
+      </w:tblPr>
+      <w:tblGrid>
+        <w:gridCol w:w="1843"/>
+        <w:gridCol w:w="2801"/>
+        <w:gridCol w:w="2833"/>
+        <w:gridCol w:w="2016"/>
+        <w:gridCol w:w="2268"/>
+        <w:gridCol w:w="1672"/>
+      </w:tblGrid>
+      <w:tr>
+        <w:tc>
+          <w:tcPr>
+            <w:tcW w:w="1843" w:type="dxa"/>
+            <w:shd w:val="clear" w:color="auto" w:fill="943634" w:themeFill="accent2" w:themeFillShade="BF"/>
+          </w:tcPr>
+          <w:p>
+            <w:pPr>
+              <w:jc w:val="center"/>
+              <w:rPr>
+                <w:rFonts w:ascii="Verdana" w:hAnsi="Verdana"/>
+                <w:color w:val="FFFFFF" w:themeColor="background1"/>
+              </w:rPr>
+            </w:pPr>
+            <w:proofErr w:type="spellStart"/>
+            <w:r>
+              <w:rPr>
+                <w:rFonts w:ascii="Verdana" w:hAnsi="Verdana"/>
+                <w:b/>
+                <w:color w:val="FFFFFF" w:themeColor="background1"/>
+              </w:rPr>
+              <w:t>Qué</w:t>
+            </w:r>
+            <w:proofErr w:type="spellEnd"/>
+            <w:r>
+              <w:rPr>
+                <w:rFonts w:ascii="Verdana" w:hAnsi="Verdana"/>
+                <w:b/>
+                <w:color w:val="FFFFFF" w:themeColor="background1"/>
+              </w:rPr>
+              <w:t xml:space="preserve"> </w:t>
+            </w:r>
+            <w:proofErr w:type="spellStart"/>
+            <w:r>
+              <w:rPr>
+                <w:rFonts w:ascii="Verdana" w:hAnsi="Verdana"/>
+                <w:b/>
+                <w:color w:val="FFFFFF" w:themeColor="background1"/>
+              </w:rPr>
+              <w:t>queremos</w:t>
+            </w:r>
+            <w:proofErr w:type="spellEnd"/>
+            <w:r>
+              <w:rPr>
+                <w:rFonts w:ascii="Verdana" w:hAnsi="Verdana"/>
+                <w:b/>
+                <w:color w:val="FFFFFF" w:themeColor="background1"/>
+              </w:rPr>
+              <w:t xml:space="preserve"> </w:t>
+            </w:r>
+            <w:proofErr w:type="spellStart"/>
+            <w:r>
+              <w:rPr>
+                <w:rFonts w:ascii="Verdana" w:hAnsi="Verdana"/>
+                <w:b/>
+                <w:color w:val="FFFFFF" w:themeColor="background1"/>
+              </w:rPr>
+              <w:t>medir</w:t>
+            </w:r>
+            <w:proofErr w:type="spellEnd"/>
+          </w:p>
+        </w:tc>
+        <w:tc>
+          <w:tcPr>
+            <w:tcW w:w="2801" w:type="dxa"/>
+            <w:shd w:val="clear" w:color="auto" w:fill="943634" w:themeFill="accent2" w:themeFillShade="BF"/>
+          </w:tcPr>
+          <w:p>
+            <w:pPr>
+              <w:jc w:val="center"/>
+              <w:rPr>
+                <w:rFonts w:ascii="Verdana" w:hAnsi="Verdana"/>
+                <w:color w:val="FFFFFF" w:themeColor="background1"/>
+              </w:rPr>
+            </w:pPr>
+            <w:proofErr w:type="spellStart"/>
+            <w:r>
+              <w:rPr>
+                <w:rFonts w:ascii="Verdana" w:hAnsi="Verdana"/>
+                <w:b/>
+                <w:color w:val="FFFFFF" w:themeColor="background1"/>
+              </w:rPr>
+              <w:t>Objetivo</w:t>
+            </w:r>
+            <w:proofErr w:type="spellEnd"/>
+            <w:r>
+              <w:rPr>
+                <w:rFonts w:ascii="Verdana" w:hAnsi="Verdana"/>
+                <w:b/>
+                <w:color w:val="FFFFFF" w:themeColor="background1"/>
+              </w:rPr>
+              <w:t xml:space="preserve"> del </w:t>
+            </w:r>
+            <w:proofErr w:type="spellStart"/>
+            <w:r>
+              <w:rPr>
+                <w:rFonts w:ascii="Verdana" w:hAnsi="Verdana"/>
+                <w:b/>
+                <w:color w:val="FFFFFF" w:themeColor="background1"/>
+              </w:rPr>
+              <w:t>proyecto</w:t>
+            </w:r>
+            <w:proofErr w:type="spellEnd"/>
+          </w:p>
+        </w:tc>
+        <w:tc>
+          <w:tcPr>
+            <w:tcW w:w="2833" w:type="dxa"/>
+            <w:shd w:val="clear" w:color="auto" w:fill="943634" w:themeFill="accent2" w:themeFillShade="BF"/>
+          </w:tcPr>
+          <w:p>
+            <w:pPr>
+              <w:jc w:val="center"/>
+              <w:rPr>
+                <w:rFonts w:ascii="Verdana" w:hAnsi="Verdana"/>
+                <w:color w:val="FFFFFF" w:themeColor="background1"/>
+              </w:rPr>
+            </w:pPr>
+            <w:proofErr w:type="spellStart"/>
+            <w:r>
+              <w:rPr>
+                <w:rFonts w:ascii="Verdana" w:hAnsi="Verdana"/>
+                <w:b/>
+                <w:color w:val="FFFFFF" w:themeColor="background1"/>
+              </w:rPr>
+              <w:t>Métrica</w:t>
+            </w:r>
+            <w:proofErr w:type="spellEnd"/>
+          </w:p>
+        </w:tc>
+        <w:tc>
+          <w:tcPr>
+            <w:tcW w:w="2016" w:type="dxa"/>
+            <w:shd w:val="clear" w:color="auto" w:fill="943634" w:themeFill="accent2" w:themeFillShade="BF"/>
+          </w:tcPr>
+          <w:p>
+            <w:pPr>
+              <w:jc w:val="center"/>
+              <w:rPr>
+                <w:rFonts w:ascii="Verdana" w:hAnsi="Verdana"/>
+                <w:color w:val="FFFFFF" w:themeColor="background1"/>
+              </w:rPr>
+            </w:pPr>
+            <w:r>
+              <w:rPr>
+                <w:rFonts w:ascii="Verdana" w:hAnsi="Verdana"/>
+                <w:b/>
+                <w:color w:val="FFFFFF" w:themeColor="background1"/>
+              </w:rPr>
+              <w:t>Meta</w:t>
+            </w:r>
+          </w:p>
+        </w:tc>
+        <w:tc>
+          <w:tcPr>
+            <w:tcW w:w="2268" w:type="dxa"/>
+            <w:shd w:val="clear" w:color="auto" w:fill="943634" w:themeFill="accent2" w:themeFillShade="BF"/>
+          </w:tcPr>
+          <w:p>
+            <w:pPr>
+              <w:jc w:val="center"/>
+              <w:rPr>
+                <w:rFonts w:ascii="Verdana" w:hAnsi="Verdana"/>
+                <w:color w:val="FFFFFF" w:themeColor="background1"/>
+              </w:rPr>
+            </w:pPr>
+            <w:r>
+              <w:rPr>
+                <w:rFonts w:ascii="Verdana" w:hAnsi="Verdana"/>
+                <w:b/>
+                <w:color w:val="FFFFFF" w:themeColor="background1"/>
+              </w:rPr>
+              <w:t xml:space="preserve">Fuente de </w:t>
+            </w:r>
+            <w:proofErr w:type="spellStart"/>
+            <w:r>
+              <w:rPr>
+                <w:rFonts w:ascii="Verdana" w:hAnsi="Verdana"/>
+                <w:b/>
+                <w:color w:val="FFFFFF" w:themeColor="background1"/>
+              </w:rPr>
+              <w:t>datos</w:t>
+            </w:r>
+            <w:proofErr w:type="spellEnd"/>
+          </w:p>
+        </w:tc>
+        <w:tc>
+          <w:tcPr>
+            <w:tcW w:w="1672" w:type="dxa"/>
+            <w:shd w:val="clear" w:color="auto" w:fill="943634" w:themeFill="accent2" w:themeFillShade="BF"/>
+          </w:tcPr>
+          <w:p>
+            <w:pPr>
+              <w:jc w:val="center"/>
+              <w:rPr>
+                <w:rFonts w:ascii="Verdana" w:hAnsi="Verdana"/>
+                <w:color w:val="FFFFFF" w:themeColor="background1"/>
+              </w:rPr>
+            </w:pPr>
+            <w:proofErr w:type="spellStart"/>
+            <w:r>
+              <w:rPr>
+                <w:rFonts w:ascii="Verdana" w:hAnsi="Verdana"/>
+                <w:b/>
+                <w:color w:val="FFFFFF" w:themeColor="background1"/>
+              </w:rPr>
+              <w:t>Proceso</w:t>
+            </w:r>
+            <w:proofErr w:type="spellEnd"/>
+          </w:p>
+        </w:tc>
+      </w:tr>
+      <w:tr>
+        <w:tc>
+          <w:tcPr>
+            <w:tcW w:w="1843" w:type="dxa"/>
+          </w:tcPr>
+          <w:p>
+            <w:pPr>
+              <w:rPr>
+                <w:rFonts w:ascii="Verdana" w:hAnsi="Verdana"/>
+                <w:lang w:val="es-EC"/>
+              </w:rPr>
+            </w:pPr>
+            <w:r>
+              <w:rPr>
+                <w:rFonts w:ascii="Verdana" w:hAnsi="Verdana"/>
+                <w:color w:val="000000"/>
+                <w:lang w:val="es-EC"/>
+              </w:rPr>
+              <w:t>Cumplimiento del cronograma del Sprint</w:t>
+            </w:r>
+          </w:p>
+        </w:tc>
+        <w:tc>
+          <w:tcPr>
+            <w:tcW w:w="2801" w:type="dxa"/>
+          </w:tcPr>
+          <w:p>
+            <w:pPr>
+              <w:rPr>
+                <w:rFonts w:ascii="Verdana" w:hAnsi="Verdana"/>
+                <w:lang w:val="es-EC"/>
+              </w:rPr>
+            </w:pPr>
+            <w:r>
+              <w:rPr>
+                <w:rFonts w:ascii="Verdana" w:hAnsi="Verdana"/>
+                <w:color w:val="000000"/>
+                <w:lang w:val="es-EC"/>
+              </w:rPr>
+              <w:t>Determinar si las actividades planificadas se completan dentro del periodo establecido.</w:t>
+            </w:r>
+          </w:p>
+        </w:tc>
+        <w:tc>
+          <w:tcPr>
+            <w:tcW w:w="2833" w:type="dxa"/>
+          </w:tcPr>
+          <w:p>
+            <w:pPr>
+              <w:rPr>
+                <w:rFonts w:ascii="Verdana" w:hAnsi="Verdana"/>
+                <w:lang w:val="es-EC"/>
+              </w:rPr>
+            </w:pPr>
+            <w:r>
+              <w:rPr>
+                <w:rFonts w:ascii="Verdana" w:hAnsi="Verdana"/>
+                <w:color w:val="000000"/>
+                <w:lang w:val="es-EC"/>
+              </w:rPr>
+              <w:t>SPI = avance ejecutado / avance planificado</w:t>
+            </w:r>
+          </w:p>
+        </w:tc>
+        <w:tc>
+          <w:tcPr>
+            <w:tcW w:w="2016" w:type="dxa"/>
+          </w:tcPr>
+          <w:p>
+            <w:pPr>
+              <w:jc w:val="center"/>
+              <w:rPr>
+                <w:rFonts w:ascii="Verdana" w:hAnsi="Verdana"/>
+              </w:rPr>
+            </w:pPr>
+            <w:r>
+              <w:rPr>
+                <w:rFonts w:ascii="Verdana" w:hAnsi="Verdana"/>
+                <w:color w:val="000000"/>
+              </w:rPr>
+              <w:t>&gt;= 0,95</w:t>
+            </w:r>
+          </w:p>
+        </w:tc>
+        <w:tc>
+          <w:tcPr>
+            <w:tcW w:w="2268" w:type="dxa"/>
+          </w:tcPr>
+          <w:p>
+            <w:pPr>
+              <w:rPr>
+                <w:rFonts w:ascii="Verdana" w:hAnsi="Verdana"/>
+                <w:lang w:val="es-EC"/>
+              </w:rPr>
+            </w:pPr>
+            <w:r>
+              <w:rPr>
+                <w:rFonts w:ascii="Verdana" w:hAnsi="Verdana"/>
+                <w:color w:val="000000"/>
+                <w:lang w:val="es-EC"/>
+              </w:rPr>
+              <w:t>Jira y Plan de Seguimiento del Sprint</w:t>
+            </w:r>
+          </w:p>
+        </w:tc>
+        <w:tc>
+          <w:tcPr>
+            <w:tcW w:w="1672" w:type="dxa"/>
+          </w:tcPr>
+          <w:p>
+            <w:pPr>
+              <w:rPr>
+                <w:rFonts w:ascii="Verdana" w:hAnsi="Verdana"/>
+              </w:rPr>
+            </w:pPr>
+            <w:r>
+              <w:rPr>
+                <w:rFonts w:ascii="Verdana" w:hAnsi="Verdana"/>
+                <w:color w:val="000000"/>
+              </w:rPr>
+              <w:t xml:space="preserve">Control del </w:t>
+            </w:r>
+            <w:proofErr w:type="spellStart"/>
+            <w:r>
+              <w:rPr>
+                <w:rFonts w:ascii="Verdana" w:hAnsi="Verdana"/>
+                <w:color w:val="000000"/>
+              </w:rPr>
+              <w:t>cronograma</w:t>
+            </w:r>
+            <w:proofErr w:type="spellEnd"/>
+          </w:p>
+        </w:tc>
+      </w:tr>
+      <w:tr>
+        <w:tc>
+          <w:tcPr>
+            <w:tcW w:w="1843" w:type="dxa"/>
+          </w:tcPr>
+          <w:p>
+            <w:pPr>
+              <w:rPr>
+                <w:rFonts w:ascii="Verdana" w:hAnsi="Verdana"/>
+                <w:lang w:val="es-EC"/>
+              </w:rPr>
+            </w:pPr>
+            <w:r>
+              <w:rPr>
+                <w:rFonts w:ascii="Verdana" w:hAnsi="Verdana"/>
+                <w:color w:val="000000"/>
+                <w:lang w:val="es-EC"/>
+              </w:rPr>
+              <w:t>Cumplimiento del alcance del MVP</w:t>
+            </w:r>
+          </w:p>
+        </w:tc>
+        <w:tc>
+          <w:tcPr>
+            <w:tcW w:w="2801" w:type="dxa"/>
+          </w:tcPr>
+          <w:p>
+            <w:pPr>
+              <w:rPr>
+                <w:rFonts w:ascii="Verdana" w:hAnsi="Verdana"/>
+                <w:lang w:val="es-EC"/>
+              </w:rPr>
+            </w:pPr>
+            <w:r>
+              <w:rPr>
+                <w:rFonts w:ascii="Verdana" w:hAnsi="Verdana"/>
+                <w:color w:val="000000"/>
+                <w:lang w:val="es-EC"/>
+              </w:rPr>
+              <w:t>Verificar que el desarrollo priorizado corresponda con el alcance aprobado del MVP.</w:t>
+            </w:r>
+          </w:p>
+        </w:tc>
+        <w:tc>
+          <w:tcPr>
+            <w:tcW w:w="2833" w:type="dxa"/>
+          </w:tcPr>
+          <w:p>
+            <w:pPr>
+              <w:rPr>
+                <w:rFonts w:ascii="Verdana" w:hAnsi="Verdana"/>
+                <w:lang w:val="es-EC"/>
+              </w:rPr>
+            </w:pPr>
+            <w:r>
+              <w:rPr>
+                <w:rFonts w:ascii="Verdana" w:hAnsi="Verdana"/>
+                <w:color w:val="000000"/>
+                <w:lang w:val="es-EC"/>
+              </w:rPr>
+              <w:t>Requisitos del MVP implementados y aceptados / requisitos planificados</w:t>
+            </w:r>
+          </w:p>
+        </w:tc>
+        <w:tc>
+          <w:tcPr>
+            <w:tcW w:w="2016" w:type="dxa"/>
+          </w:tcPr>
+          <w:p>
+            <w:pPr>
+              <w:jc w:val="center"/>
+              <w:rPr>
+                <w:rFonts w:ascii="Verdana" w:hAnsi="Verdana"/>
+                <w:lang w:val="es-EC"/>
+              </w:rPr>
+            </w:pPr>
+            <w:r>
+              <w:rPr>
+                <w:rFonts w:ascii="Verdana" w:hAnsi="Verdana"/>
+                <w:color w:val="000000"/>
+                <w:lang w:val="es-EC"/>
+              </w:rPr>
+              <w:t>&gt;= 95 % y ningún requisito crítico omitido</w:t>
+            </w:r>
+          </w:p>
+        </w:tc>
+        <w:tc>
+          <w:tcPr>
+            <w:tcW w:w="2268" w:type="dxa"/>
+          </w:tcPr>
+          <w:p>
+            <w:pPr>
+              <w:rPr>
+                <w:rFonts w:ascii="Verdana" w:hAnsi="Verdana"/>
+              </w:rPr>
+            </w:pPr>
+            <w:proofErr w:type="spellStart"/>
+            <w:r>
+              <w:rPr>
+                <w:rFonts w:ascii="Verdana" w:hAnsi="Verdana"/>
+                <w:color w:val="000000"/>
+              </w:rPr>
+              <w:t>Documento</w:t>
+            </w:r>
+            <w:proofErr w:type="spellEnd"/>
+            <w:r>
+              <w:rPr>
+                <w:rFonts w:ascii="Verdana" w:hAnsi="Verdana"/>
+                <w:color w:val="000000"/>
+              </w:rPr>
+              <w:t xml:space="preserve"> MVP, Product Backlog y Jira</w:t>
+            </w:r>
+          </w:p>
+        </w:tc>
+        <w:tc>
+          <w:tcPr>
+            <w:tcW w:w="1672" w:type="dxa"/>
+          </w:tcPr>
+          <w:p>
+            <w:pPr>
+              <w:rPr>
+                <w:rFonts w:ascii="Verdana" w:hAnsi="Verdana"/>
+              </w:rPr>
+            </w:pPr>
+            <w:proofErr w:type="spellStart"/>
+            <w:r>
+              <w:rPr>
+                <w:rFonts w:ascii="Verdana" w:hAnsi="Verdana"/>
+                <w:color w:val="000000"/>
+              </w:rPr>
+              <w:t>Gestión</w:t>
+            </w:r>
+            <w:proofErr w:type="spellEnd"/>
+            <w:r>
+              <w:rPr>
+                <w:rFonts w:ascii="Verdana" w:hAnsi="Verdana"/>
+                <w:color w:val="000000"/>
+              </w:rPr>
+              <w:t xml:space="preserve"> del </w:t>
+            </w:r>
+            <w:proofErr w:type="spellStart"/>
+            <w:r>
+              <w:rPr>
+                <w:rFonts w:ascii="Verdana" w:hAnsi="Verdana"/>
+                <w:color w:val="000000"/>
+              </w:rPr>
+              <w:t>alcance</w:t>
+            </w:r>
+            <w:proofErr w:type="spellEnd"/>
+          </w:p>
+        </w:tc>
+      </w:tr>
+      <w:tr>
+        <w:tc>
+          <w:tcPr>
+            <w:tcW w:w="1843" w:type="dxa"/>
+          </w:tcPr>
+          <w:p>
+            <w:pPr>
+              <w:rPr>
+                <w:rFonts w:ascii="Verdana" w:hAnsi="Verdana"/>
+              </w:rPr>
+            </w:pPr>
+            <w:proofErr w:type="spellStart"/>
+            <w:r>
+              <w:rPr>
+                <w:rFonts w:ascii="Verdana" w:hAnsi="Verdana"/>
+                <w:color w:val="000000"/>
+              </w:rPr>
+              <w:t>Cumplimiento</w:t>
+            </w:r>
+            <w:proofErr w:type="spellEnd"/>
+            <w:r>
+              <w:rPr>
+                <w:rFonts w:ascii="Verdana" w:hAnsi="Verdana"/>
+                <w:color w:val="000000"/>
+              </w:rPr>
+              <w:t xml:space="preserve"> de </w:t>
+            </w:r>
+            <w:proofErr w:type="spellStart"/>
+            <w:r>
+              <w:rPr>
+                <w:rFonts w:ascii="Verdana" w:hAnsi="Verdana"/>
+                <w:color w:val="000000"/>
+              </w:rPr>
+              <w:t>requisitos</w:t>
+            </w:r>
+            <w:proofErr w:type="spellEnd"/>
+            <w:r>
+              <w:rPr>
+                <w:rFonts w:ascii="Verdana" w:hAnsi="Verdana"/>
+                <w:color w:val="000000"/>
+              </w:rPr>
+              <w:t xml:space="preserve"> </w:t>
+            </w:r>
+            <w:proofErr w:type="spellStart"/>
+            <w:r>
+              <w:rPr>
+                <w:rFonts w:ascii="Verdana" w:hAnsi="Verdana"/>
+                <w:color w:val="000000"/>
+              </w:rPr>
+              <w:t>funcionales</w:t>
+            </w:r>
+            <w:proofErr w:type="spellEnd"/>
+          </w:p>
+        </w:tc>
+        <w:tc>
+          <w:tcPr>
+            <w:tcW w:w="2801" w:type="dxa"/>
+          </w:tcPr>
+          <w:p>
+            <w:pPr>
+              <w:rPr>
+                <w:rFonts w:ascii="Verdana" w:hAnsi="Verdana"/>
+                <w:lang w:val="es-EC"/>
+              </w:rPr>
+            </w:pPr>
+            <w:r>
+              <w:rPr>
+                <w:rFonts w:ascii="Verdana" w:hAnsi="Verdana"/>
+                <w:color w:val="000000"/>
+                <w:lang w:val="es-EC"/>
+              </w:rPr>
+              <w:t>Comprobar que las funciones desarrolladas respondan a los requisitos aprobados.</w:t>
+            </w:r>
+          </w:p>
+        </w:tc>
+        <w:tc>
+          <w:tcPr>
+            <w:tcW w:w="2833" w:type="dxa"/>
+          </w:tcPr>
+          <w:p>
+            <w:pPr>
+              <w:rPr>
+                <w:rFonts w:ascii="Verdana" w:hAnsi="Verdana"/>
+                <w:lang w:val="es-EC"/>
+              </w:rPr>
+            </w:pPr>
+            <w:r>
+              <w:rPr>
+                <w:rFonts w:ascii="Verdana" w:hAnsi="Verdana"/>
+                <w:color w:val="000000"/>
+                <w:lang w:val="es-EC"/>
+              </w:rPr>
+              <w:t>Requisitos funcionales conformes / requisitos funcionales evaluados</w:t>
+            </w:r>
+          </w:p>
+        </w:tc>
+        <w:tc>
+          <w:tcPr>
+            <w:tcW w:w="2016" w:type="dxa"/>
+          </w:tcPr>
+          <w:p>
+            <w:pPr>
+              <w:jc w:val="center"/>
+              <w:rPr>
+                <w:rFonts w:ascii="Verdana" w:hAnsi="Verdana"/>
+              </w:rPr>
+            </w:pPr>
+            <w:r>
+              <w:rPr>
+                <w:rFonts w:ascii="Verdana" w:hAnsi="Verdana"/>
+                <w:color w:val="000000"/>
+              </w:rPr>
+              <w:t>&gt;= 95 %</w:t>
+            </w:r>
+          </w:p>
+        </w:tc>
+        <w:tc>
+          <w:tcPr>
+            <w:tcW w:w="2268" w:type="dxa"/>
+          </w:tcPr>
+          <w:p>
+            <w:pPr>
+              <w:rPr>
+                <w:rFonts w:ascii="Verdana" w:hAnsi="Verdana"/>
+                <w:lang w:val="es-EC"/>
+              </w:rPr>
+            </w:pPr>
+            <w:r>
+              <w:rPr>
+                <w:rFonts w:ascii="Verdana" w:hAnsi="Verdana"/>
+                <w:color w:val="000000"/>
+                <w:lang w:val="es-EC"/>
+              </w:rPr>
+              <w:t>Especificación de Requerimientos y resultados de pruebas</w:t>
+            </w:r>
+          </w:p>
+        </w:tc>
+        <w:tc>
+          <w:tcPr>
+            <w:tcW w:w="1672" w:type="dxa"/>
+          </w:tcPr>
+          <w:p>
+            <w:pPr>
+              <w:rPr>
+                <w:rFonts w:ascii="Verdana" w:hAnsi="Verdana"/>
+              </w:rPr>
+            </w:pPr>
+            <w:r>
+              <w:rPr>
+                <w:rFonts w:ascii="Verdana" w:hAnsi="Verdana"/>
+                <w:color w:val="000000"/>
+              </w:rPr>
+              <w:t xml:space="preserve">Control de </w:t>
+            </w:r>
+            <w:proofErr w:type="spellStart"/>
+            <w:r>
+              <w:rPr>
+                <w:rFonts w:ascii="Verdana" w:hAnsi="Verdana"/>
+                <w:color w:val="000000"/>
+              </w:rPr>
+              <w:t>calidad</w:t>
+            </w:r>
+            <w:proofErr w:type="spellEnd"/>
+          </w:p>
+        </w:tc>
+      </w:tr>
+      <w:tr>
+        <w:tc>
+          <w:tcPr>
+            <w:tcW w:w="1843" w:type="dxa"/>
+          </w:tcPr>
+          <w:p>
+            <w:pPr>
+              <w:rPr>
+                <w:rFonts w:ascii="Verdana" w:hAnsi="Verdana"/>
+              </w:rPr>
+            </w:pPr>
+            <w:proofErr w:type="spellStart"/>
+            <w:r>
+              <w:rPr>
+                <w:rFonts w:ascii="Verdana" w:hAnsi="Verdana"/>
+                <w:color w:val="000000"/>
+              </w:rPr>
+              <w:t>Aprobación</w:t>
+            </w:r>
+            <w:proofErr w:type="spellEnd"/>
+            <w:r>
+              <w:rPr>
+                <w:rFonts w:ascii="Verdana" w:hAnsi="Verdana"/>
+                <w:color w:val="000000"/>
+              </w:rPr>
+              <w:t xml:space="preserve"> de </w:t>
+            </w:r>
+            <w:proofErr w:type="spellStart"/>
+            <w:r>
+              <w:rPr>
+                <w:rFonts w:ascii="Verdana" w:hAnsi="Verdana"/>
+                <w:color w:val="000000"/>
+              </w:rPr>
+              <w:t>pruebas</w:t>
+            </w:r>
+            <w:proofErr w:type="spellEnd"/>
+            <w:r>
+              <w:rPr>
+                <w:rFonts w:ascii="Verdana" w:hAnsi="Verdana"/>
+                <w:color w:val="000000"/>
+              </w:rPr>
+              <w:t xml:space="preserve"> </w:t>
+            </w:r>
+            <w:proofErr w:type="spellStart"/>
+            <w:r>
+              <w:rPr>
+                <w:rFonts w:ascii="Verdana" w:hAnsi="Verdana"/>
+                <w:color w:val="000000"/>
+              </w:rPr>
+              <w:t>funcionales</w:t>
+            </w:r>
+            <w:proofErr w:type="spellEnd"/>
+          </w:p>
+        </w:tc>
+        <w:tc>
+          <w:tcPr>
+            <w:tcW w:w="2801" w:type="dxa"/>
+          </w:tcPr>
+          <w:p>
+            <w:pPr>
+              <w:rPr>
+                <w:rFonts w:ascii="Verdana" w:hAnsi="Verdana"/>
+                <w:lang w:val="es-EC"/>
+              </w:rPr>
+            </w:pPr>
+            <w:r>
+              <w:rPr>
+                <w:rFonts w:ascii="Verdana" w:hAnsi="Verdana"/>
+                <w:color w:val="000000"/>
+                <w:lang w:val="es-EC"/>
+              </w:rPr>
+              <w:t>Medir la proporción de casos de prueba ejecutados satisfactoriamente.</w:t>
+            </w:r>
+          </w:p>
+        </w:tc>
+        <w:tc>
+          <w:tcPr>
+            <w:tcW w:w="2833" w:type="dxa"/>
+          </w:tcPr>
+          <w:p>
+            <w:pPr>
+              <w:rPr>
+                <w:rFonts w:ascii="Verdana" w:hAnsi="Verdana"/>
+                <w:lang w:val="es-EC"/>
+              </w:rPr>
+            </w:pPr>
+            <w:r>
+              <w:rPr>
+                <w:rFonts w:ascii="Verdana" w:hAnsi="Verdana"/>
+                <w:color w:val="000000"/>
+                <w:lang w:val="es-EC"/>
+              </w:rPr>
+              <w:t>Casos de prueba aprobados / casos de prueba ejecutados</w:t>
+            </w:r>
+          </w:p>
+        </w:tc>
+        <w:tc>
+          <w:tcPr>
+            <w:tcW w:w="2016" w:type="dxa"/>
+          </w:tcPr>
+          <w:p>
+            <w:pPr>
+              <w:jc w:val="center"/>
+              <w:rPr>
+                <w:rFonts w:ascii="Verdana" w:hAnsi="Verdana"/>
+                <w:lang w:val="es-EC"/>
+              </w:rPr>
+            </w:pPr>
+            <w:r>
+              <w:rPr>
+                <w:rFonts w:ascii="Verdana" w:hAnsi="Verdana"/>
+                <w:color w:val="000000"/>
+                <w:lang w:val="es-EC"/>
+              </w:rPr>
+              <w:t xml:space="preserve">&gt;= 95 % y 100 % de los casos </w:t>
+            </w:r>
+            <w:proofErr w:type="spellStart"/>
+            <w:r>
+              <w:rPr>
+                <w:rFonts w:ascii="Verdana" w:hAnsi="Verdana"/>
+                <w:color w:val="000000"/>
+                <w:lang w:val="es-EC"/>
+              </w:rPr>
+              <w:t>Highest</w:t>
+            </w:r>
+            <w:proofErr w:type="spellEnd"/>
+          </w:p>
+        </w:tc>
+        <w:tc>
+          <w:tcPr>
+            <w:tcW w:w="2268" w:type="dxa"/>
+          </w:tcPr>
+          <w:p>
+            <w:pPr>
+              <w:rPr>
+                <w:rFonts w:ascii="Verdana" w:hAnsi="Verdana"/>
+                <w:lang w:val="es-EC"/>
+              </w:rPr>
+            </w:pPr>
+            <w:r>
+              <w:rPr>
+                <w:rFonts w:ascii="Verdana" w:hAnsi="Verdana"/>
+                <w:color w:val="000000"/>
+                <w:lang w:val="es-EC"/>
+              </w:rPr>
+              <w:t>Plan de pruebas, evidencias y registro de defectos</w:t>
+            </w:r>
+          </w:p>
+        </w:tc>
+        <w:tc>
+          <w:tcPr>
+            <w:tcW w:w="1672" w:type="dxa"/>
+          </w:tcPr>
+          <w:p>
+            <w:pPr>
+              <w:rPr>
+                <w:rFonts w:ascii="Verdana" w:hAnsi="Verdana"/>
+              </w:rPr>
+            </w:pPr>
+            <w:proofErr w:type="spellStart"/>
+            <w:r>
+              <w:rPr>
+                <w:rFonts w:ascii="Verdana" w:hAnsi="Verdana"/>
+                <w:color w:val="000000"/>
+              </w:rPr>
+              <w:t>Aseguramiento</w:t>
+            </w:r>
+            <w:proofErr w:type="spellEnd"/>
+            <w:r>
+              <w:rPr>
+                <w:rFonts w:ascii="Verdana" w:hAnsi="Verdana"/>
+                <w:color w:val="000000"/>
+              </w:rPr>
+              <w:t xml:space="preserve"> de la </w:t>
+            </w:r>
+            <w:proofErr w:type="spellStart"/>
+            <w:r>
+              <w:rPr>
+                <w:rFonts w:ascii="Verdana" w:hAnsi="Verdana"/>
+                <w:color w:val="000000"/>
+              </w:rPr>
+              <w:t>calidad</w:t>
+            </w:r>
+            <w:proofErr w:type="spellEnd"/>
+          </w:p>
+        </w:tc>
+      </w:tr>
+      <w:tr>
+        <w:tc>
+          <w:tcPr>
+            <w:tcW w:w="1843" w:type="dxa"/>
+          </w:tcPr>
+          <w:p>
+            <w:pPr>
+              <w:rPr>
+                <w:rFonts w:ascii="Verdana" w:hAnsi="Verdana"/>
+                <w:lang w:val="es-EC"/>
+              </w:rPr>
+            </w:pPr>
+            <w:r>
+              <w:rPr>
+                <w:rFonts w:ascii="Verdana" w:hAnsi="Verdana"/>
+                <w:color w:val="000000"/>
+                <w:lang w:val="es-EC"/>
+              </w:rPr>
+              <w:t>Cierre de defectos y observaciones</w:t>
+            </w:r>
+          </w:p>
+        </w:tc>
+        <w:tc>
+          <w:tcPr>
+            <w:tcW w:w="2801" w:type="dxa"/>
+          </w:tcPr>
+          <w:p>
+            <w:pPr>
+              <w:rPr>
+                <w:rFonts w:ascii="Verdana" w:hAnsi="Verdana"/>
+                <w:lang w:val="es-EC"/>
+              </w:rPr>
+            </w:pPr>
+            <w:r>
+              <w:rPr>
+                <w:rFonts w:ascii="Verdana" w:hAnsi="Verdana"/>
+                <w:color w:val="000000"/>
+                <w:lang w:val="es-EC"/>
+              </w:rPr>
+              <w:t>Medir la atención de defectos y observaciones generados durante las revisiones.</w:t>
+            </w:r>
+          </w:p>
+        </w:tc>
+        <w:tc>
+          <w:tcPr>
+            <w:tcW w:w="2833" w:type="dxa"/>
+          </w:tcPr>
+          <w:p>
+            <w:pPr>
+              <w:rPr>
+                <w:rFonts w:ascii="Verdana" w:hAnsi="Verdana"/>
+                <w:lang w:val="es-EC"/>
+              </w:rPr>
+            </w:pPr>
+            <w:r>
+              <w:rPr>
+                <w:rFonts w:ascii="Verdana" w:hAnsi="Verdana"/>
+                <w:color w:val="000000"/>
+                <w:lang w:val="es-EC"/>
+              </w:rPr>
+              <w:t>Defectos cerrados y verificados / defectos registrados</w:t>
+            </w:r>
+          </w:p>
+        </w:tc>
+        <w:tc>
+          <w:tcPr>
+            <w:tcW w:w="2016" w:type="dxa"/>
+          </w:tcPr>
+          <w:p>
+            <w:pPr>
+              <w:jc w:val="center"/>
+              <w:rPr>
+                <w:rFonts w:ascii="Verdana" w:hAnsi="Verdana"/>
+              </w:rPr>
+            </w:pPr>
+            <w:r>
+              <w:rPr>
+                <w:rFonts w:ascii="Verdana" w:hAnsi="Verdana"/>
+                <w:color w:val="000000"/>
+              </w:rPr>
+              <w:t xml:space="preserve">&gt;= 90 % y 100 % de </w:t>
+            </w:r>
+            <w:proofErr w:type="spellStart"/>
+            <w:r>
+              <w:rPr>
+                <w:rFonts w:ascii="Verdana" w:hAnsi="Verdana"/>
+                <w:color w:val="000000"/>
+              </w:rPr>
+              <w:t>defectos</w:t>
+            </w:r>
+            <w:proofErr w:type="spellEnd"/>
+            <w:r>
+              <w:rPr>
+                <w:rFonts w:ascii="Verdana" w:hAnsi="Verdana"/>
+                <w:color w:val="000000"/>
+              </w:rPr>
+              <w:t xml:space="preserve"> </w:t>
+            </w:r>
+            <w:proofErr w:type="spellStart"/>
+            <w:r>
+              <w:rPr>
+                <w:rFonts w:ascii="Verdana" w:hAnsi="Verdana"/>
+                <w:color w:val="000000"/>
+              </w:rPr>
+              <w:t>críticos</w:t>
+            </w:r>
+            <w:proofErr w:type="spellEnd"/>
+          </w:p>
+        </w:tc>
+        <w:tc>
+          <w:tcPr>
+            <w:tcW w:w="2268" w:type="dxa"/>
+          </w:tcPr>
+          <w:p>
+            <w:pPr>
+              <w:rPr>
+                <w:rFonts w:ascii="Verdana" w:hAnsi="Verdana"/>
+                <w:lang w:val="es-EC"/>
+              </w:rPr>
+            </w:pPr>
+            <w:r>
+              <w:rPr>
+                <w:rFonts w:ascii="Verdana" w:hAnsi="Verdana"/>
+                <w:color w:val="000000"/>
+                <w:lang w:val="es-EC"/>
+              </w:rPr>
+              <w:t>Jira, registro de incidencias y evidencias de corrección</w:t>
+            </w:r>
+          </w:p>
+        </w:tc>
+        <w:tc>
+          <w:tcPr>
+            <w:tcW w:w="1672" w:type="dxa"/>
+          </w:tcPr>
+          <w:p>
+            <w:pPr>
+              <w:rPr>
+                <w:rFonts w:ascii="Verdana" w:hAnsi="Verdana"/>
+              </w:rPr>
+            </w:pPr>
+            <w:proofErr w:type="spellStart"/>
+            <w:r>
+              <w:rPr>
+                <w:rFonts w:ascii="Verdana" w:hAnsi="Verdana"/>
+                <w:color w:val="000000"/>
+              </w:rPr>
+              <w:t>Gestión</w:t>
+            </w:r>
+            <w:proofErr w:type="spellEnd"/>
+            <w:r>
+              <w:rPr>
+                <w:rFonts w:ascii="Verdana" w:hAnsi="Verdana"/>
+                <w:color w:val="000000"/>
+              </w:rPr>
+              <w:t xml:space="preserve"> de la </w:t>
+            </w:r>
+            <w:proofErr w:type="spellStart"/>
+            <w:r>
+              <w:rPr>
+                <w:rFonts w:ascii="Verdana" w:hAnsi="Verdana"/>
+                <w:color w:val="000000"/>
+              </w:rPr>
+              <w:t>calidad</w:t>
+            </w:r>
+            <w:proofErr w:type="spellEnd"/>
+          </w:p>
+        </w:tc>
+      </w:tr>
+      <w:tr>
+        <w:tc>
+          <w:tcPr>
+            <w:tcW w:w="1843" w:type="dxa"/>
+          </w:tcPr>
+          <w:p>
+            <w:pPr>
+              <w:rPr>
+                <w:rFonts w:ascii="Verdana" w:hAnsi="Verdana"/>
+                <w:lang w:val="es-EC"/>
+              </w:rPr>
+            </w:pPr>
+            <w:r>
+              <w:rPr>
+                <w:rFonts w:ascii="Verdana" w:hAnsi="Verdana"/>
+                <w:color w:val="000000"/>
+                <w:lang w:val="es-EC"/>
+              </w:rPr>
+              <w:t xml:space="preserve">Cumplimiento </w:t>
+            </w:r>
+            <w:r>
+              <w:rPr>
+                <w:rFonts w:ascii="Verdana" w:hAnsi="Verdana"/>
+                <w:color w:val="000000"/>
+                <w:lang w:val="es-EC"/>
+              </w:rPr>
+              <w:lastRenderedPageBreak/>
+              <w:t>de controles de seguridad</w:t>
+            </w:r>
+          </w:p>
+        </w:tc>
+        <w:tc>
+          <w:tcPr>
+            <w:tcW w:w="2801" w:type="dxa"/>
+          </w:tcPr>
+          <w:p>
+            <w:pPr>
+              <w:rPr>
+                <w:rFonts w:ascii="Verdana" w:hAnsi="Verdana"/>
+                <w:lang w:val="es-EC"/>
+              </w:rPr>
+            </w:pPr>
+            <w:r>
+              <w:rPr>
+                <w:rFonts w:ascii="Verdana" w:hAnsi="Verdana"/>
+                <w:color w:val="000000"/>
+                <w:lang w:val="es-EC"/>
+              </w:rPr>
+              <w:lastRenderedPageBreak/>
+              <w:t xml:space="preserve">Verificar autenticación, </w:t>
+            </w:r>
+            <w:r>
+              <w:rPr>
+                <w:rFonts w:ascii="Verdana" w:hAnsi="Verdana"/>
+                <w:color w:val="000000"/>
+                <w:lang w:val="es-EC"/>
+              </w:rPr>
+              <w:lastRenderedPageBreak/>
+              <w:t>autorización, protección de contraseñas y manejo seguro de datos.</w:t>
+            </w:r>
+          </w:p>
+        </w:tc>
+        <w:tc>
+          <w:tcPr>
+            <w:tcW w:w="2833" w:type="dxa"/>
+          </w:tcPr>
+          <w:p>
+            <w:pPr>
+              <w:rPr>
+                <w:rFonts w:ascii="Verdana" w:hAnsi="Verdana"/>
+                <w:lang w:val="es-EC"/>
+              </w:rPr>
+            </w:pPr>
+            <w:r>
+              <w:rPr>
+                <w:rFonts w:ascii="Verdana" w:hAnsi="Verdana"/>
+                <w:color w:val="000000"/>
+                <w:lang w:val="es-EC"/>
+              </w:rPr>
+              <w:lastRenderedPageBreak/>
+              <w:t xml:space="preserve">Controles de seguridad </w:t>
+            </w:r>
+            <w:r>
+              <w:rPr>
+                <w:rFonts w:ascii="Verdana" w:hAnsi="Verdana"/>
+                <w:color w:val="000000"/>
+                <w:lang w:val="es-EC"/>
+              </w:rPr>
+              <w:lastRenderedPageBreak/>
+              <w:t>conformes / controles evaluados</w:t>
+            </w:r>
+          </w:p>
+        </w:tc>
+        <w:tc>
+          <w:tcPr>
+            <w:tcW w:w="2016" w:type="dxa"/>
+          </w:tcPr>
+          <w:p>
+            <w:pPr>
+              <w:jc w:val="center"/>
+              <w:rPr>
+                <w:rFonts w:ascii="Verdana" w:hAnsi="Verdana"/>
+              </w:rPr>
+            </w:pPr>
+            <w:r>
+              <w:rPr>
+                <w:rFonts w:ascii="Verdana" w:hAnsi="Verdana"/>
+                <w:color w:val="000000"/>
+              </w:rPr>
+              <w:lastRenderedPageBreak/>
+              <w:t xml:space="preserve">100 % de </w:t>
+            </w:r>
+            <w:proofErr w:type="spellStart"/>
+            <w:r>
+              <w:rPr>
+                <w:rFonts w:ascii="Verdana" w:hAnsi="Verdana"/>
+                <w:color w:val="000000"/>
+              </w:rPr>
+              <w:lastRenderedPageBreak/>
+              <w:t>controles</w:t>
+            </w:r>
+            <w:proofErr w:type="spellEnd"/>
+            <w:r>
+              <w:rPr>
+                <w:rFonts w:ascii="Verdana" w:hAnsi="Verdana"/>
+                <w:color w:val="000000"/>
+              </w:rPr>
+              <w:t xml:space="preserve"> Highest y &gt;= 95 % total</w:t>
+            </w:r>
+          </w:p>
+        </w:tc>
+        <w:tc>
+          <w:tcPr>
+            <w:tcW w:w="2268" w:type="dxa"/>
+          </w:tcPr>
+          <w:p>
+            <w:pPr>
+              <w:rPr>
+                <w:rFonts w:ascii="Verdana" w:hAnsi="Verdana"/>
+                <w:lang w:val="es-EC"/>
+              </w:rPr>
+            </w:pPr>
+            <w:r>
+              <w:rPr>
+                <w:rFonts w:ascii="Verdana" w:hAnsi="Verdana"/>
+                <w:color w:val="000000"/>
+                <w:lang w:val="es-EC"/>
+              </w:rPr>
+              <w:lastRenderedPageBreak/>
+              <w:t xml:space="preserve">Matriz de calidad, </w:t>
+            </w:r>
+            <w:r>
+              <w:rPr>
+                <w:rFonts w:ascii="Verdana" w:hAnsi="Verdana"/>
+                <w:color w:val="000000"/>
+                <w:lang w:val="es-EC"/>
+              </w:rPr>
+              <w:lastRenderedPageBreak/>
+              <w:t>pruebas de seguridad y revisión de código</w:t>
+            </w:r>
+          </w:p>
+        </w:tc>
+        <w:tc>
+          <w:tcPr>
+            <w:tcW w:w="1672" w:type="dxa"/>
+          </w:tcPr>
+          <w:p>
+            <w:pPr>
+              <w:rPr>
+                <w:rFonts w:ascii="Verdana" w:hAnsi="Verdana"/>
+              </w:rPr>
+            </w:pPr>
+            <w:proofErr w:type="spellStart"/>
+            <w:r>
+              <w:rPr>
+                <w:rFonts w:ascii="Verdana" w:hAnsi="Verdana"/>
+                <w:color w:val="000000"/>
+              </w:rPr>
+              <w:lastRenderedPageBreak/>
+              <w:t>Seguridad</w:t>
+            </w:r>
+            <w:proofErr w:type="spellEnd"/>
+            <w:r>
+              <w:rPr>
+                <w:rFonts w:ascii="Verdana" w:hAnsi="Verdana"/>
+                <w:color w:val="000000"/>
+              </w:rPr>
+              <w:t xml:space="preserve"> </w:t>
+            </w:r>
+            <w:r>
+              <w:rPr>
+                <w:rFonts w:ascii="Verdana" w:hAnsi="Verdana"/>
+                <w:color w:val="000000"/>
+              </w:rPr>
+              <w:lastRenderedPageBreak/>
+              <w:t>del software</w:t>
+            </w:r>
+          </w:p>
+        </w:tc>
+      </w:tr>
+      <w:tr>
+        <w:tc>
+          <w:tcPr>
+            <w:tcW w:w="1843" w:type="dxa"/>
+          </w:tcPr>
+          <w:p>
+            <w:pPr>
+              <w:rPr>
+                <w:rFonts w:ascii="Verdana" w:hAnsi="Verdana"/>
+              </w:rPr>
+            </w:pPr>
+            <w:proofErr w:type="spellStart"/>
+            <w:r>
+              <w:rPr>
+                <w:rFonts w:ascii="Verdana" w:hAnsi="Verdana"/>
+                <w:color w:val="000000"/>
+              </w:rPr>
+              <w:lastRenderedPageBreak/>
+              <w:t>Cumplimiento</w:t>
+            </w:r>
+            <w:proofErr w:type="spellEnd"/>
+            <w:r>
+              <w:rPr>
+                <w:rFonts w:ascii="Verdana" w:hAnsi="Verdana"/>
+                <w:color w:val="000000"/>
+              </w:rPr>
+              <w:t xml:space="preserve"> de </w:t>
+            </w:r>
+            <w:proofErr w:type="spellStart"/>
+            <w:r>
+              <w:rPr>
+                <w:rFonts w:ascii="Verdana" w:hAnsi="Verdana"/>
+                <w:color w:val="000000"/>
+              </w:rPr>
+              <w:t>accesibilidad</w:t>
+            </w:r>
+            <w:proofErr w:type="spellEnd"/>
+          </w:p>
+        </w:tc>
+        <w:tc>
+          <w:tcPr>
+            <w:tcW w:w="2801" w:type="dxa"/>
+          </w:tcPr>
+          <w:p>
+            <w:pPr>
+              <w:rPr>
+                <w:rFonts w:ascii="Verdana" w:hAnsi="Verdana"/>
+                <w:lang w:val="es-EC"/>
+              </w:rPr>
+            </w:pPr>
+            <w:r>
+              <w:rPr>
+                <w:rFonts w:ascii="Verdana" w:hAnsi="Verdana"/>
+                <w:color w:val="000000"/>
+                <w:lang w:val="es-EC"/>
+              </w:rPr>
+              <w:t>Verificar que las pantallas priorizadas sean comprensibles y operables por distintos usuarios.</w:t>
+            </w:r>
+          </w:p>
+        </w:tc>
+        <w:tc>
+          <w:tcPr>
+            <w:tcW w:w="2833" w:type="dxa"/>
+          </w:tcPr>
+          <w:p>
+            <w:pPr>
+              <w:rPr>
+                <w:rFonts w:ascii="Verdana" w:hAnsi="Verdana"/>
+                <w:lang w:val="es-EC"/>
+              </w:rPr>
+            </w:pPr>
+            <w:r>
+              <w:rPr>
+                <w:rFonts w:ascii="Verdana" w:hAnsi="Verdana"/>
+                <w:color w:val="000000"/>
+                <w:lang w:val="es-EC"/>
+              </w:rPr>
+              <w:t>Criterios de accesibilidad conformes / criterios evaluados</w:t>
+            </w:r>
+          </w:p>
+        </w:tc>
+        <w:tc>
+          <w:tcPr>
+            <w:tcW w:w="2016" w:type="dxa"/>
+          </w:tcPr>
+          <w:p>
+            <w:pPr>
+              <w:jc w:val="center"/>
+              <w:rPr>
+                <w:rFonts w:ascii="Verdana" w:hAnsi="Verdana"/>
+              </w:rPr>
+            </w:pPr>
+            <w:r>
+              <w:rPr>
+                <w:rFonts w:ascii="Verdana" w:hAnsi="Verdana"/>
+                <w:color w:val="000000"/>
+              </w:rPr>
+              <w:t xml:space="preserve">&gt;= 90 % y sin </w:t>
+            </w:r>
+            <w:proofErr w:type="spellStart"/>
+            <w:r>
+              <w:rPr>
+                <w:rFonts w:ascii="Verdana" w:hAnsi="Verdana"/>
+                <w:color w:val="000000"/>
+              </w:rPr>
+              <w:t>incumplimientos</w:t>
+            </w:r>
+            <w:proofErr w:type="spellEnd"/>
+            <w:r>
+              <w:rPr>
+                <w:rFonts w:ascii="Verdana" w:hAnsi="Verdana"/>
+                <w:color w:val="000000"/>
+              </w:rPr>
+              <w:t xml:space="preserve"> </w:t>
+            </w:r>
+            <w:proofErr w:type="spellStart"/>
+            <w:r>
+              <w:rPr>
+                <w:rFonts w:ascii="Verdana" w:hAnsi="Verdana"/>
+                <w:color w:val="000000"/>
+              </w:rPr>
+              <w:t>críticos</w:t>
+            </w:r>
+            <w:proofErr w:type="spellEnd"/>
+          </w:p>
+        </w:tc>
+        <w:tc>
+          <w:tcPr>
+            <w:tcW w:w="2268" w:type="dxa"/>
+          </w:tcPr>
+          <w:p>
+            <w:pPr>
+              <w:rPr>
+                <w:rFonts w:ascii="Verdana" w:hAnsi="Verdana"/>
+                <w:lang w:val="es-EC"/>
+              </w:rPr>
+            </w:pPr>
+            <w:r>
+              <w:rPr>
+                <w:rFonts w:ascii="Verdana" w:hAnsi="Verdana"/>
+                <w:color w:val="000000"/>
+                <w:lang w:val="es-EC"/>
+              </w:rPr>
+              <w:t>Lista de verificación WCAG, pruebas de teclado y capturas</w:t>
+            </w:r>
+          </w:p>
+        </w:tc>
+        <w:tc>
+          <w:tcPr>
+            <w:tcW w:w="1672" w:type="dxa"/>
+          </w:tcPr>
+          <w:p>
+            <w:pPr>
+              <w:rPr>
+                <w:rFonts w:ascii="Verdana" w:hAnsi="Verdana"/>
+              </w:rPr>
+            </w:pPr>
+            <w:proofErr w:type="spellStart"/>
+            <w:r>
+              <w:rPr>
+                <w:rFonts w:ascii="Verdana" w:hAnsi="Verdana"/>
+                <w:color w:val="000000"/>
+              </w:rPr>
+              <w:t>Diseño</w:t>
+            </w:r>
+            <w:proofErr w:type="spellEnd"/>
+            <w:r>
+              <w:rPr>
+                <w:rFonts w:ascii="Verdana" w:hAnsi="Verdana"/>
+                <w:color w:val="000000"/>
+              </w:rPr>
+              <w:t xml:space="preserve"> y </w:t>
+            </w:r>
+            <w:proofErr w:type="spellStart"/>
+            <w:r>
+              <w:rPr>
+                <w:rFonts w:ascii="Verdana" w:hAnsi="Verdana"/>
+                <w:color w:val="000000"/>
+              </w:rPr>
+              <w:t>accesibilidad</w:t>
+            </w:r>
+            <w:proofErr w:type="spellEnd"/>
+          </w:p>
+        </w:tc>
+      </w:tr>
+      <w:tr>
+        <w:tc>
+          <w:tcPr>
+            <w:tcW w:w="1843" w:type="dxa"/>
+          </w:tcPr>
+          <w:p>
+            <w:pPr>
+              <w:rPr>
+                <w:rFonts w:ascii="Verdana" w:hAnsi="Verdana"/>
+              </w:rPr>
+            </w:pPr>
+            <w:proofErr w:type="spellStart"/>
+            <w:r>
+              <w:rPr>
+                <w:rFonts w:ascii="Verdana" w:hAnsi="Verdana"/>
+                <w:color w:val="000000"/>
+              </w:rPr>
+              <w:t>Consistencia</w:t>
+            </w:r>
+            <w:proofErr w:type="spellEnd"/>
+            <w:r>
+              <w:rPr>
+                <w:rFonts w:ascii="Verdana" w:hAnsi="Verdana"/>
+                <w:color w:val="000000"/>
+              </w:rPr>
+              <w:t xml:space="preserve"> visual del </w:t>
+            </w:r>
+            <w:proofErr w:type="spellStart"/>
+            <w:r>
+              <w:rPr>
+                <w:rFonts w:ascii="Verdana" w:hAnsi="Verdana"/>
+                <w:color w:val="000000"/>
+              </w:rPr>
+              <w:t>producto</w:t>
+            </w:r>
+            <w:proofErr w:type="spellEnd"/>
+          </w:p>
+        </w:tc>
+        <w:tc>
+          <w:tcPr>
+            <w:tcW w:w="2801" w:type="dxa"/>
+          </w:tcPr>
+          <w:p>
+            <w:pPr>
+              <w:rPr>
+                <w:rFonts w:ascii="Verdana" w:hAnsi="Verdana"/>
+                <w:lang w:val="es-EC"/>
+              </w:rPr>
+            </w:pPr>
+            <w:r>
+              <w:rPr>
+                <w:rFonts w:ascii="Verdana" w:hAnsi="Verdana"/>
+                <w:color w:val="000000"/>
+                <w:lang w:val="es-EC"/>
+              </w:rPr>
+              <w:t>Comprobar la aplicación de colores, tipografía, encabezados y componentes definidos.</w:t>
+            </w:r>
+          </w:p>
+        </w:tc>
+        <w:tc>
+          <w:tcPr>
+            <w:tcW w:w="2833" w:type="dxa"/>
+          </w:tcPr>
+          <w:p>
+            <w:pPr>
+              <w:rPr>
+                <w:rFonts w:ascii="Verdana" w:hAnsi="Verdana"/>
+                <w:lang w:val="es-EC"/>
+              </w:rPr>
+            </w:pPr>
+            <w:r>
+              <w:rPr>
+                <w:rFonts w:ascii="Verdana" w:hAnsi="Verdana"/>
+                <w:color w:val="000000"/>
+                <w:lang w:val="es-EC"/>
+              </w:rPr>
+              <w:t>Pantallas conformes con lineamientos visuales / pantallas revisadas</w:t>
+            </w:r>
+          </w:p>
+        </w:tc>
+        <w:tc>
+          <w:tcPr>
+            <w:tcW w:w="2016" w:type="dxa"/>
+          </w:tcPr>
+          <w:p>
+            <w:pPr>
+              <w:jc w:val="center"/>
+              <w:rPr>
+                <w:rFonts w:ascii="Verdana" w:hAnsi="Verdana"/>
+              </w:rPr>
+            </w:pPr>
+            <w:r>
+              <w:rPr>
+                <w:rFonts w:ascii="Verdana" w:hAnsi="Verdana"/>
+                <w:color w:val="000000"/>
+              </w:rPr>
+              <w:t>&gt;= 95 %</w:t>
+            </w:r>
+          </w:p>
+        </w:tc>
+        <w:tc>
+          <w:tcPr>
+            <w:tcW w:w="2268" w:type="dxa"/>
+          </w:tcPr>
+          <w:p>
+            <w:pPr>
+              <w:rPr>
+                <w:rFonts w:ascii="Verdana" w:hAnsi="Verdana"/>
+                <w:lang w:val="es-EC"/>
+              </w:rPr>
+            </w:pPr>
+            <w:r>
+              <w:rPr>
+                <w:rFonts w:ascii="Verdana" w:hAnsi="Verdana"/>
+                <w:color w:val="000000"/>
+                <w:lang w:val="es-EC"/>
+              </w:rPr>
+              <w:t>Wireframes, CSS, lineamientos visuales y capturas</w:t>
+            </w:r>
+          </w:p>
+        </w:tc>
+        <w:tc>
+          <w:tcPr>
+            <w:tcW w:w="1672" w:type="dxa"/>
+          </w:tcPr>
+          <w:p>
+            <w:pPr>
+              <w:rPr>
+                <w:rFonts w:ascii="Verdana" w:hAnsi="Verdana"/>
+              </w:rPr>
+            </w:pPr>
+            <w:proofErr w:type="spellStart"/>
+            <w:r>
+              <w:rPr>
+                <w:rFonts w:ascii="Verdana" w:hAnsi="Verdana"/>
+                <w:color w:val="000000"/>
+              </w:rPr>
+              <w:t>Diseño</w:t>
+            </w:r>
+            <w:proofErr w:type="spellEnd"/>
+            <w:r>
+              <w:rPr>
+                <w:rFonts w:ascii="Verdana" w:hAnsi="Verdana"/>
+                <w:color w:val="000000"/>
+              </w:rPr>
+              <w:t xml:space="preserve"> UI/UX</w:t>
+            </w:r>
+          </w:p>
+        </w:tc>
+      </w:tr>
+      <w:tr>
+        <w:tc>
+          <w:tcPr>
+            <w:tcW w:w="1843" w:type="dxa"/>
+          </w:tcPr>
+          <w:p>
+            <w:pPr>
+              <w:rPr>
+                <w:rFonts w:ascii="Verdana" w:hAnsi="Verdana"/>
+                <w:lang w:val="es-EC"/>
+              </w:rPr>
+            </w:pPr>
+            <w:r>
+              <w:rPr>
+                <w:rFonts w:ascii="Verdana" w:hAnsi="Verdana"/>
+                <w:color w:val="000000"/>
+                <w:lang w:val="es-EC"/>
+              </w:rPr>
+              <w:t>Rendimiento de páginas y servicios</w:t>
+            </w:r>
+          </w:p>
+        </w:tc>
+        <w:tc>
+          <w:tcPr>
+            <w:tcW w:w="2801" w:type="dxa"/>
+          </w:tcPr>
+          <w:p>
+            <w:pPr>
+              <w:rPr>
+                <w:rFonts w:ascii="Verdana" w:hAnsi="Verdana"/>
+                <w:lang w:val="es-EC"/>
+              </w:rPr>
+            </w:pPr>
+            <w:r>
+              <w:rPr>
+                <w:rFonts w:ascii="Verdana" w:hAnsi="Verdana"/>
+                <w:color w:val="000000"/>
+                <w:lang w:val="es-EC"/>
+              </w:rPr>
+              <w:t>Verificar que las funciones principales respondan en tiempos aceptables.</w:t>
+            </w:r>
+          </w:p>
+        </w:tc>
+        <w:tc>
+          <w:tcPr>
+            <w:tcW w:w="2833" w:type="dxa"/>
+          </w:tcPr>
+          <w:p>
+            <w:pPr>
+              <w:rPr>
+                <w:rFonts w:ascii="Verdana" w:hAnsi="Verdana"/>
+                <w:lang w:val="es-EC"/>
+              </w:rPr>
+            </w:pPr>
+            <w:r>
+              <w:rPr>
+                <w:rFonts w:ascii="Verdana" w:hAnsi="Verdana"/>
+                <w:color w:val="000000"/>
+                <w:lang w:val="es-EC"/>
+              </w:rPr>
+              <w:t>Tiempo promedio de carga de páginas y respuesta de servicios</w:t>
+            </w:r>
+          </w:p>
+        </w:tc>
+        <w:tc>
+          <w:tcPr>
+            <w:tcW w:w="2016" w:type="dxa"/>
+          </w:tcPr>
+          <w:p>
+            <w:pPr>
+              <w:jc w:val="center"/>
+              <w:rPr>
+                <w:rFonts w:ascii="Verdana" w:hAnsi="Verdana"/>
+                <w:lang w:val="es-EC"/>
+              </w:rPr>
+            </w:pPr>
+            <w:r>
+              <w:rPr>
+                <w:rFonts w:ascii="Verdana" w:hAnsi="Verdana"/>
+                <w:color w:val="000000"/>
+                <w:lang w:val="es-EC"/>
+              </w:rPr>
+              <w:t>Páginas &lt;= 3 s; servicios principales &lt;= 2 s en pruebas</w:t>
+            </w:r>
+          </w:p>
+        </w:tc>
+        <w:tc>
+          <w:tcPr>
+            <w:tcW w:w="2268" w:type="dxa"/>
+          </w:tcPr>
+          <w:p>
+            <w:pPr>
+              <w:rPr>
+                <w:rFonts w:ascii="Verdana" w:hAnsi="Verdana"/>
+                <w:lang w:val="es-EC"/>
+              </w:rPr>
+            </w:pPr>
+            <w:r>
+              <w:rPr>
+                <w:rFonts w:ascii="Verdana" w:hAnsi="Verdana"/>
+                <w:color w:val="000000"/>
+                <w:lang w:val="es-EC"/>
+              </w:rPr>
+              <w:t>Herramientas del navegador y registros de tiempos</w:t>
+            </w:r>
+          </w:p>
+        </w:tc>
+        <w:tc>
+          <w:tcPr>
+            <w:tcW w:w="1672" w:type="dxa"/>
+          </w:tcPr>
+          <w:p>
+            <w:pPr>
+              <w:rPr>
+                <w:rFonts w:ascii="Verdana" w:hAnsi="Verdana"/>
+              </w:rPr>
+            </w:pPr>
+            <w:r>
+              <w:rPr>
+                <w:rFonts w:ascii="Verdana" w:hAnsi="Verdana"/>
+                <w:color w:val="000000"/>
+              </w:rPr>
+              <w:t xml:space="preserve">Control del </w:t>
+            </w:r>
+            <w:proofErr w:type="spellStart"/>
+            <w:r>
+              <w:rPr>
+                <w:rFonts w:ascii="Verdana" w:hAnsi="Verdana"/>
+                <w:color w:val="000000"/>
+              </w:rPr>
+              <w:t>rendimiento</w:t>
+            </w:r>
+            <w:proofErr w:type="spellEnd"/>
+          </w:p>
+        </w:tc>
+      </w:tr>
+      <w:tr>
+        <w:tc>
+          <w:tcPr>
+            <w:tcW w:w="1843" w:type="dxa"/>
+          </w:tcPr>
+          <w:p>
+            <w:pPr>
+              <w:rPr>
+                <w:rFonts w:ascii="Verdana" w:hAnsi="Verdana"/>
+              </w:rPr>
+            </w:pPr>
+            <w:proofErr w:type="spellStart"/>
+            <w:r>
+              <w:rPr>
+                <w:rFonts w:ascii="Verdana" w:hAnsi="Verdana"/>
+                <w:color w:val="000000"/>
+              </w:rPr>
+              <w:t>Trazabilidad</w:t>
+            </w:r>
+            <w:proofErr w:type="spellEnd"/>
+            <w:r>
+              <w:rPr>
+                <w:rFonts w:ascii="Verdana" w:hAnsi="Verdana"/>
+                <w:color w:val="000000"/>
+              </w:rPr>
+              <w:t xml:space="preserve"> de </w:t>
+            </w:r>
+            <w:proofErr w:type="spellStart"/>
+            <w:r>
+              <w:rPr>
+                <w:rFonts w:ascii="Verdana" w:hAnsi="Verdana"/>
+                <w:color w:val="000000"/>
+              </w:rPr>
+              <w:t>requisitos</w:t>
+            </w:r>
+            <w:proofErr w:type="spellEnd"/>
+          </w:p>
+        </w:tc>
+        <w:tc>
+          <w:tcPr>
+            <w:tcW w:w="2801" w:type="dxa"/>
+          </w:tcPr>
+          <w:p>
+            <w:pPr>
+              <w:rPr>
+                <w:rFonts w:ascii="Verdana" w:hAnsi="Verdana"/>
+                <w:lang w:val="es-EC"/>
+              </w:rPr>
+            </w:pPr>
+            <w:r>
+              <w:rPr>
+                <w:rFonts w:ascii="Verdana" w:hAnsi="Verdana"/>
+                <w:color w:val="000000"/>
+                <w:lang w:val="es-EC"/>
+              </w:rPr>
+              <w:t>Confirmar la relación entre requisitos, historias, pantallas, clases, código y pruebas.</w:t>
+            </w:r>
+          </w:p>
+        </w:tc>
+        <w:tc>
+          <w:tcPr>
+            <w:tcW w:w="2833" w:type="dxa"/>
+          </w:tcPr>
+          <w:p>
+            <w:pPr>
+              <w:rPr>
+                <w:rFonts w:ascii="Verdana" w:hAnsi="Verdana"/>
+                <w:lang w:val="es-EC"/>
+              </w:rPr>
+            </w:pPr>
+            <w:r>
+              <w:rPr>
+                <w:rFonts w:ascii="Verdana" w:hAnsi="Verdana"/>
+                <w:color w:val="000000"/>
+                <w:lang w:val="es-EC"/>
+              </w:rPr>
+              <w:t>Requisitos con trazabilidad completa / requisitos del MVP</w:t>
+            </w:r>
+          </w:p>
+        </w:tc>
+        <w:tc>
+          <w:tcPr>
+            <w:tcW w:w="2016" w:type="dxa"/>
+          </w:tcPr>
+          <w:p>
+            <w:pPr>
+              <w:jc w:val="center"/>
+              <w:rPr>
+                <w:rFonts w:ascii="Verdana" w:hAnsi="Verdana"/>
+              </w:rPr>
+            </w:pPr>
+            <w:r>
+              <w:rPr>
+                <w:rFonts w:ascii="Verdana" w:hAnsi="Verdana"/>
+                <w:color w:val="000000"/>
+              </w:rPr>
+              <w:t>100 %</w:t>
+            </w:r>
+          </w:p>
+        </w:tc>
+        <w:tc>
+          <w:tcPr>
+            <w:tcW w:w="2268" w:type="dxa"/>
+          </w:tcPr>
+          <w:p>
+            <w:pPr>
+              <w:rPr>
+                <w:rFonts w:ascii="Verdana" w:hAnsi="Verdana"/>
+                <w:lang w:val="es-EC"/>
+              </w:rPr>
+            </w:pPr>
+            <w:r>
+              <w:rPr>
+                <w:rFonts w:ascii="Verdana" w:hAnsi="Verdana"/>
+                <w:color w:val="000000"/>
+                <w:lang w:val="es-EC"/>
+              </w:rPr>
+              <w:t>Matriz de trazabilidad, Jira, modelos y repositorio Git</w:t>
+            </w:r>
+          </w:p>
+        </w:tc>
+        <w:tc>
+          <w:tcPr>
+            <w:tcW w:w="1672" w:type="dxa"/>
+          </w:tcPr>
+          <w:p>
+            <w:pPr>
+              <w:rPr>
+                <w:rFonts w:ascii="Verdana" w:hAnsi="Verdana"/>
+              </w:rPr>
+            </w:pPr>
+            <w:proofErr w:type="spellStart"/>
+            <w:r>
+              <w:rPr>
+                <w:rFonts w:ascii="Verdana" w:hAnsi="Verdana"/>
+                <w:color w:val="000000"/>
+              </w:rPr>
+              <w:t>Gestión</w:t>
+            </w:r>
+            <w:proofErr w:type="spellEnd"/>
+            <w:r>
+              <w:rPr>
+                <w:rFonts w:ascii="Verdana" w:hAnsi="Verdana"/>
+                <w:color w:val="000000"/>
+              </w:rPr>
+              <w:t xml:space="preserve"> de </w:t>
+            </w:r>
+            <w:proofErr w:type="spellStart"/>
+            <w:r>
+              <w:rPr>
+                <w:rFonts w:ascii="Verdana" w:hAnsi="Verdana"/>
+                <w:color w:val="000000"/>
+              </w:rPr>
+              <w:t>requisitos</w:t>
+            </w:r>
+            <w:proofErr w:type="spellEnd"/>
+          </w:p>
+        </w:tc>
+      </w:tr>
+      <w:tr>
+        <w:tc>
+          <w:tcPr>
+            <w:tcW w:w="1843" w:type="dxa"/>
+          </w:tcPr>
+          <w:p>
+            <w:pPr>
+              <w:jc w:val="center"/>
+              <w:rPr>
+                <w:rFonts w:ascii="Verdana" w:hAnsi="Verdana"/>
+              </w:rPr>
+            </w:pPr>
+            <w:proofErr w:type="spellStart"/>
+            <w:r>
+              <w:rPr>
+                <w:rFonts w:ascii="Verdana" w:hAnsi="Verdana"/>
+                <w:b/>
+                <w:color w:val="FFFFFF"/>
+              </w:rPr>
+              <w:t>Qué</w:t>
+            </w:r>
+            <w:proofErr w:type="spellEnd"/>
+            <w:r>
+              <w:rPr>
+                <w:rFonts w:ascii="Verdana" w:hAnsi="Verdana"/>
+                <w:b/>
+                <w:color w:val="FFFFFF"/>
+              </w:rPr>
+              <w:t xml:space="preserve"> </w:t>
+            </w:r>
+            <w:proofErr w:type="spellStart"/>
+            <w:r>
+              <w:rPr>
+                <w:rFonts w:ascii="Verdana" w:hAnsi="Verdana"/>
+                <w:b/>
+                <w:color w:val="FFFFFF"/>
+              </w:rPr>
+              <w:t>queremos</w:t>
+            </w:r>
+            <w:proofErr w:type="spellEnd"/>
+            <w:r>
+              <w:rPr>
+                <w:rFonts w:ascii="Verdana" w:hAnsi="Verdana"/>
+                <w:b/>
+                <w:color w:val="FFFFFF"/>
+              </w:rPr>
+              <w:t xml:space="preserve"> </w:t>
+            </w:r>
+            <w:proofErr w:type="spellStart"/>
+            <w:r>
+              <w:rPr>
+                <w:rFonts w:ascii="Verdana" w:hAnsi="Verdana"/>
+                <w:b/>
+                <w:color w:val="FFFFFF"/>
+              </w:rPr>
+              <w:t>medir</w:t>
+            </w:r>
+            <w:proofErr w:type="spellEnd"/>
+          </w:p>
+        </w:tc>
+        <w:tc>
+          <w:tcPr>
+            <w:tcW w:w="2801" w:type="dxa"/>
+          </w:tcPr>
+          <w:p>
+            <w:pPr>
+              <w:jc w:val="center"/>
+              <w:rPr>
+                <w:rFonts w:ascii="Verdana" w:hAnsi="Verdana"/>
+              </w:rPr>
+            </w:pPr>
+            <w:r>
+              <w:rPr>
+                <w:rFonts w:ascii="Verdana" w:hAnsi="Verdana"/>
+                <w:b/>
+                <w:color w:val="FFFFFF"/>
+              </w:rPr>
+              <w:t>Objetivo del proyecto</w:t>
+            </w:r>
+          </w:p>
+        </w:tc>
+        <w:tc>
+          <w:tcPr>
+            <w:tcW w:w="2833" w:type="dxa"/>
+          </w:tcPr>
+          <w:p>
+            <w:pPr>
+              <w:jc w:val="center"/>
+              <w:rPr>
+                <w:rFonts w:ascii="Verdana" w:hAnsi="Verdana"/>
+              </w:rPr>
+            </w:pPr>
+            <w:r>
+              <w:rPr>
+                <w:rFonts w:ascii="Verdana" w:hAnsi="Verdana"/>
+                <w:b/>
+                <w:color w:val="FFFFFF"/>
+              </w:rPr>
+              <w:t>Métrica</w:t>
+            </w:r>
+          </w:p>
+        </w:tc>
+        <w:tc>
+          <w:tcPr>
+            <w:tcW w:w="2016" w:type="dxa"/>
+          </w:tcPr>
+          <w:p>
+            <w:pPr>
+              <w:jc w:val="center"/>
+              <w:rPr>
+                <w:rFonts w:ascii="Verdana" w:hAnsi="Verdana"/>
+              </w:rPr>
+            </w:pPr>
+            <w:r>
+              <w:rPr>
+                <w:rFonts w:ascii="Verdana" w:hAnsi="Verdana"/>
+                <w:b/>
+                <w:color w:val="FFFFFF"/>
+              </w:rPr>
+              <w:t>Meta</w:t>
+            </w:r>
+          </w:p>
+        </w:tc>
+        <w:tc>
+          <w:tcPr>
+            <w:tcW w:w="2268" w:type="dxa"/>
+          </w:tcPr>
+          <w:p>
+            <w:pPr>
+              <w:jc w:val="center"/>
+              <w:rPr>
+                <w:rFonts w:ascii="Verdana" w:hAnsi="Verdana"/>
+              </w:rPr>
+            </w:pPr>
+            <w:r>
+              <w:rPr>
+                <w:rFonts w:ascii="Verdana" w:hAnsi="Verdana"/>
+                <w:b/>
+                <w:color w:val="FFFFFF"/>
+              </w:rPr>
+              <w:t>Fuente de datos</w:t>
+            </w:r>
+          </w:p>
+        </w:tc>
+        <w:tc>
+          <w:tcPr>
+            <w:tcW w:w="1672" w:type="dxa"/>
+          </w:tcPr>
+          <w:p>
+            <w:pPr>
+              <w:jc w:val="center"/>
+              <w:rPr>
+                <w:rFonts w:ascii="Verdana" w:hAnsi="Verdana"/>
+              </w:rPr>
+            </w:pPr>
+            <w:r>
+              <w:rPr>
+                <w:rFonts w:ascii="Verdana" w:hAnsi="Verdana"/>
+                <w:b/>
+                <w:color w:val="FFFFFF"/>
+              </w:rPr>
+              <w:t>Proceso</w:t>
+            </w:r>
+          </w:p>
+        </w:tc>
+      </w:tr>
+      <w:tr>
+        <w:tc>
+          <w:tcPr>
+            <w:tcW w:w="1843" w:type="dxa"/>
+          </w:tcPr>
+          <w:p>
+            <w:pPr>
+              <w:rPr>
+                <w:rFonts w:ascii="Verdana" w:hAnsi="Verdana"/>
+              </w:rPr>
+            </w:pPr>
+            <w:proofErr w:type="spellStart"/>
+            <w:r>
+              <w:rPr>
+                <w:rFonts w:ascii="Verdana" w:hAnsi="Verdana"/>
+                <w:color w:val="000000"/>
+              </w:rPr>
+              <w:t>Cumplimiento</w:t>
+            </w:r>
+            <w:proofErr w:type="spellEnd"/>
+            <w:r>
+              <w:rPr>
+                <w:rFonts w:ascii="Verdana" w:hAnsi="Verdana"/>
+                <w:color w:val="000000"/>
+              </w:rPr>
+              <w:t xml:space="preserve"> documental</w:t>
+            </w:r>
+          </w:p>
+        </w:tc>
+        <w:tc>
+          <w:tcPr>
+            <w:tcW w:w="2801" w:type="dxa"/>
+          </w:tcPr>
+          <w:p>
+            <w:pPr>
+              <w:rPr>
+                <w:rFonts w:ascii="Verdana" w:hAnsi="Verdana"/>
+                <w:lang w:val="es-EC"/>
+              </w:rPr>
+            </w:pPr>
+            <w:r>
+              <w:rPr>
+                <w:rFonts w:ascii="Verdana" w:hAnsi="Verdana"/>
+                <w:color w:val="000000"/>
+                <w:lang w:val="es-EC"/>
+              </w:rPr>
+              <w:t xml:space="preserve">Medir el cumplimiento de estructura, </w:t>
+            </w:r>
+            <w:proofErr w:type="spellStart"/>
+            <w:r>
+              <w:rPr>
+                <w:rFonts w:ascii="Verdana" w:hAnsi="Verdana"/>
+                <w:color w:val="000000"/>
+                <w:lang w:val="es-EC"/>
+              </w:rPr>
+              <w:t>versionamiento</w:t>
+            </w:r>
+            <w:proofErr w:type="spellEnd"/>
+            <w:r>
+              <w:rPr>
+                <w:rFonts w:ascii="Verdana" w:hAnsi="Verdana"/>
+                <w:color w:val="000000"/>
+                <w:lang w:val="es-EC"/>
+              </w:rPr>
+              <w:t>, coherencia y entregables académicos.</w:t>
+            </w:r>
+          </w:p>
+        </w:tc>
+        <w:tc>
+          <w:tcPr>
+            <w:tcW w:w="2833" w:type="dxa"/>
+          </w:tcPr>
+          <w:p>
+            <w:pPr>
+              <w:rPr>
+                <w:rFonts w:ascii="Verdana" w:hAnsi="Verdana"/>
+              </w:rPr>
+            </w:pPr>
+            <w:proofErr w:type="spellStart"/>
+            <w:r>
+              <w:rPr>
+                <w:rFonts w:ascii="Verdana" w:hAnsi="Verdana"/>
+                <w:color w:val="000000"/>
+              </w:rPr>
+              <w:t>Documentos</w:t>
+            </w:r>
+            <w:proofErr w:type="spellEnd"/>
+            <w:r>
+              <w:rPr>
+                <w:rFonts w:ascii="Verdana" w:hAnsi="Verdana"/>
+                <w:color w:val="000000"/>
+              </w:rPr>
+              <w:t xml:space="preserve"> </w:t>
+            </w:r>
+            <w:proofErr w:type="spellStart"/>
+            <w:r>
+              <w:rPr>
+                <w:rFonts w:ascii="Verdana" w:hAnsi="Verdana"/>
+                <w:color w:val="000000"/>
+              </w:rPr>
+              <w:t>conformes</w:t>
+            </w:r>
+            <w:proofErr w:type="spellEnd"/>
+            <w:r>
+              <w:rPr>
+                <w:rFonts w:ascii="Verdana" w:hAnsi="Verdana"/>
+                <w:color w:val="000000"/>
+              </w:rPr>
+              <w:t xml:space="preserve"> / </w:t>
+            </w:r>
+            <w:proofErr w:type="spellStart"/>
+            <w:r>
+              <w:rPr>
+                <w:rFonts w:ascii="Verdana" w:hAnsi="Verdana"/>
+                <w:color w:val="000000"/>
+              </w:rPr>
+              <w:t>documentos</w:t>
+            </w:r>
+            <w:proofErr w:type="spellEnd"/>
+            <w:r>
+              <w:rPr>
+                <w:rFonts w:ascii="Verdana" w:hAnsi="Verdana"/>
+                <w:color w:val="000000"/>
+              </w:rPr>
+              <w:t xml:space="preserve"> revisados</w:t>
+            </w:r>
+          </w:p>
+        </w:tc>
+        <w:tc>
+          <w:tcPr>
+            <w:tcW w:w="2016" w:type="dxa"/>
+          </w:tcPr>
+          <w:p>
+            <w:pPr>
+              <w:jc w:val="center"/>
+              <w:rPr>
+                <w:rFonts w:ascii="Verdana" w:hAnsi="Verdana"/>
+              </w:rPr>
+            </w:pPr>
+            <w:r>
+              <w:rPr>
+                <w:rFonts w:ascii="Verdana" w:hAnsi="Verdana"/>
+                <w:color w:val="000000"/>
+              </w:rPr>
+              <w:t>&gt;= 97 %</w:t>
+            </w:r>
+          </w:p>
+        </w:tc>
+        <w:tc>
+          <w:tcPr>
+            <w:tcW w:w="2268" w:type="dxa"/>
+          </w:tcPr>
+          <w:p>
+            <w:pPr>
+              <w:rPr>
+                <w:rFonts w:ascii="Verdana" w:hAnsi="Verdana"/>
+                <w:lang w:val="es-EC"/>
+              </w:rPr>
+            </w:pPr>
+            <w:r>
+              <w:rPr>
+                <w:rFonts w:ascii="Verdana" w:hAnsi="Verdana"/>
+                <w:color w:val="000000"/>
+                <w:lang w:val="es-EC"/>
+              </w:rPr>
+              <w:t>Lista de revisión, Documento de Visión y repositorio documental</w:t>
+            </w:r>
+          </w:p>
+        </w:tc>
+        <w:tc>
+          <w:tcPr>
+            <w:tcW w:w="1672" w:type="dxa"/>
+          </w:tcPr>
+          <w:p>
+            <w:pPr>
+              <w:rPr>
+                <w:rFonts w:ascii="Verdana" w:hAnsi="Verdana"/>
+              </w:rPr>
+            </w:pPr>
+            <w:proofErr w:type="spellStart"/>
+            <w:r>
+              <w:rPr>
+                <w:rFonts w:ascii="Verdana" w:hAnsi="Verdana"/>
+                <w:color w:val="000000"/>
+              </w:rPr>
+              <w:t>Gestión</w:t>
+            </w:r>
+            <w:proofErr w:type="spellEnd"/>
+            <w:r>
+              <w:rPr>
+                <w:rFonts w:ascii="Verdana" w:hAnsi="Verdana"/>
+                <w:color w:val="000000"/>
+              </w:rPr>
+              <w:t xml:space="preserve"> documental</w:t>
+            </w:r>
+          </w:p>
+        </w:tc>
+      </w:tr>
+      <w:tr>
+        <w:tc>
+          <w:tcPr>
+            <w:tcW w:w="1843" w:type="dxa"/>
+          </w:tcPr>
+          <w:p>
+            <w:pPr>
+              <w:rPr>
+                <w:rFonts w:ascii="Verdana" w:hAnsi="Verdana"/>
+              </w:rPr>
+            </w:pPr>
+            <w:proofErr w:type="spellStart"/>
+            <w:r>
+              <w:rPr>
+                <w:rFonts w:ascii="Verdana" w:hAnsi="Verdana"/>
+                <w:color w:val="000000"/>
+              </w:rPr>
+              <w:lastRenderedPageBreak/>
+              <w:t>Mantenibilidad</w:t>
+            </w:r>
+            <w:proofErr w:type="spellEnd"/>
+            <w:r>
+              <w:rPr>
+                <w:rFonts w:ascii="Verdana" w:hAnsi="Verdana"/>
+                <w:color w:val="000000"/>
+              </w:rPr>
+              <w:t xml:space="preserve"> del </w:t>
+            </w:r>
+            <w:proofErr w:type="spellStart"/>
+            <w:r>
+              <w:rPr>
+                <w:rFonts w:ascii="Verdana" w:hAnsi="Verdana"/>
+                <w:color w:val="000000"/>
+              </w:rPr>
+              <w:t>código</w:t>
+            </w:r>
+            <w:proofErr w:type="spellEnd"/>
+          </w:p>
+        </w:tc>
+        <w:tc>
+          <w:tcPr>
+            <w:tcW w:w="2801" w:type="dxa"/>
+          </w:tcPr>
+          <w:p>
+            <w:pPr>
+              <w:rPr>
+                <w:rFonts w:ascii="Verdana" w:hAnsi="Verdana"/>
+                <w:lang w:val="es-EC"/>
+              </w:rPr>
+            </w:pPr>
+            <w:r>
+              <w:rPr>
+                <w:rFonts w:ascii="Verdana" w:hAnsi="Verdana"/>
+                <w:color w:val="000000"/>
+                <w:lang w:val="es-EC"/>
+              </w:rPr>
+              <w:t>Verificar estructura, convenciones, documentación técnica y ausencia de duplicación relevante.</w:t>
+            </w:r>
+          </w:p>
+        </w:tc>
+        <w:tc>
+          <w:tcPr>
+            <w:tcW w:w="2833" w:type="dxa"/>
+          </w:tcPr>
+          <w:p>
+            <w:pPr>
+              <w:rPr>
+                <w:rFonts w:ascii="Verdana" w:hAnsi="Verdana"/>
+                <w:lang w:val="es-EC"/>
+              </w:rPr>
+            </w:pPr>
+            <w:r>
+              <w:rPr>
+                <w:rFonts w:ascii="Verdana" w:hAnsi="Verdana"/>
+                <w:color w:val="000000"/>
+                <w:lang w:val="es-EC"/>
+              </w:rPr>
+              <w:t>Criterios de mantenibilidad conformes / criterios evaluados</w:t>
+            </w:r>
+          </w:p>
+        </w:tc>
+        <w:tc>
+          <w:tcPr>
+            <w:tcW w:w="2016" w:type="dxa"/>
+          </w:tcPr>
+          <w:p>
+            <w:pPr>
+              <w:jc w:val="center"/>
+              <w:rPr>
+                <w:rFonts w:ascii="Verdana" w:hAnsi="Verdana"/>
+              </w:rPr>
+            </w:pPr>
+            <w:r>
+              <w:rPr>
+                <w:rFonts w:ascii="Verdana" w:hAnsi="Verdana"/>
+                <w:color w:val="000000"/>
+              </w:rPr>
+              <w:t>&gt;= 90 %</w:t>
+            </w:r>
+          </w:p>
+        </w:tc>
+        <w:tc>
+          <w:tcPr>
+            <w:tcW w:w="2268" w:type="dxa"/>
+          </w:tcPr>
+          <w:p>
+            <w:pPr>
+              <w:rPr>
+                <w:rFonts w:ascii="Verdana" w:hAnsi="Verdana"/>
+                <w:lang w:val="es-EC"/>
+              </w:rPr>
+            </w:pPr>
+            <w:r>
+              <w:rPr>
+                <w:rFonts w:ascii="Verdana" w:hAnsi="Verdana"/>
+                <w:color w:val="000000"/>
+                <w:lang w:val="es-EC"/>
+              </w:rPr>
+              <w:t>Revisión de código, README y repositorio Git</w:t>
+            </w:r>
+          </w:p>
+        </w:tc>
+        <w:tc>
+          <w:tcPr>
+            <w:tcW w:w="1672" w:type="dxa"/>
+          </w:tcPr>
+          <w:p>
+            <w:pPr>
+              <w:rPr>
+                <w:rFonts w:ascii="Verdana" w:hAnsi="Verdana"/>
+              </w:rPr>
+            </w:pPr>
+            <w:r>
+              <w:rPr>
+                <w:rFonts w:ascii="Verdana" w:hAnsi="Verdana"/>
+                <w:color w:val="000000"/>
+              </w:rPr>
+              <w:t>Desarrollo de software</w:t>
+            </w:r>
+          </w:p>
+        </w:tc>
+      </w:tr>
+      <w:tr>
+        <w:tc>
+          <w:tcPr>
+            <w:tcW w:w="1843" w:type="dxa"/>
+          </w:tcPr>
+          <w:p>
+            <w:pPr>
+              <w:rPr>
+                <w:rFonts w:ascii="Verdana" w:hAnsi="Verdana"/>
+              </w:rPr>
+            </w:pPr>
+            <w:proofErr w:type="spellStart"/>
+            <w:r>
+              <w:rPr>
+                <w:rFonts w:ascii="Verdana" w:hAnsi="Verdana"/>
+                <w:color w:val="000000"/>
+              </w:rPr>
+              <w:t>Evidencias</w:t>
+            </w:r>
+            <w:proofErr w:type="spellEnd"/>
+            <w:r>
+              <w:rPr>
+                <w:rFonts w:ascii="Verdana" w:hAnsi="Verdana"/>
+                <w:color w:val="000000"/>
+              </w:rPr>
+              <w:t xml:space="preserve"> de </w:t>
+            </w:r>
+            <w:proofErr w:type="spellStart"/>
+            <w:r>
+              <w:rPr>
+                <w:rFonts w:ascii="Verdana" w:hAnsi="Verdana"/>
+                <w:color w:val="000000"/>
+              </w:rPr>
+              <w:t>actividades</w:t>
+            </w:r>
+            <w:proofErr w:type="spellEnd"/>
+            <w:r>
+              <w:rPr>
+                <w:rFonts w:ascii="Verdana" w:hAnsi="Verdana"/>
+                <w:color w:val="000000"/>
+              </w:rPr>
+              <w:t xml:space="preserve"> </w:t>
+            </w:r>
+            <w:proofErr w:type="spellStart"/>
+            <w:r>
+              <w:rPr>
+                <w:rFonts w:ascii="Verdana" w:hAnsi="Verdana"/>
+                <w:color w:val="000000"/>
+              </w:rPr>
+              <w:t>completadas</w:t>
+            </w:r>
+            <w:proofErr w:type="spellEnd"/>
+          </w:p>
+        </w:tc>
+        <w:tc>
+          <w:tcPr>
+            <w:tcW w:w="2801" w:type="dxa"/>
+          </w:tcPr>
+          <w:p>
+            <w:pPr>
+              <w:rPr>
+                <w:rFonts w:ascii="Verdana" w:hAnsi="Verdana"/>
+                <w:lang w:val="es-EC"/>
+              </w:rPr>
+            </w:pPr>
+            <w:r>
+              <w:rPr>
+                <w:rFonts w:ascii="Verdana" w:hAnsi="Verdana"/>
+                <w:color w:val="000000"/>
+                <w:lang w:val="es-EC"/>
+              </w:rPr>
+              <w:t>Comprobar que las tareas finalizadas cuenten con evidencia suficiente.</w:t>
+            </w:r>
+          </w:p>
+        </w:tc>
+        <w:tc>
+          <w:tcPr>
+            <w:tcW w:w="2833" w:type="dxa"/>
+          </w:tcPr>
+          <w:p>
+            <w:pPr>
+              <w:rPr>
+                <w:rFonts w:ascii="Verdana" w:hAnsi="Verdana"/>
+                <w:lang w:val="es-EC"/>
+              </w:rPr>
+            </w:pPr>
+            <w:r>
+              <w:rPr>
+                <w:rFonts w:ascii="Verdana" w:hAnsi="Verdana"/>
+                <w:color w:val="000000"/>
+                <w:lang w:val="es-EC"/>
+              </w:rPr>
+              <w:t>Tareas cerradas con evidencia / tareas cerradas</w:t>
+            </w:r>
+          </w:p>
+        </w:tc>
+        <w:tc>
+          <w:tcPr>
+            <w:tcW w:w="2016" w:type="dxa"/>
+          </w:tcPr>
+          <w:p>
+            <w:pPr>
+              <w:jc w:val="center"/>
+              <w:rPr>
+                <w:rFonts w:ascii="Verdana" w:hAnsi="Verdana"/>
+              </w:rPr>
+            </w:pPr>
+            <w:r>
+              <w:rPr>
+                <w:rFonts w:ascii="Verdana" w:hAnsi="Verdana"/>
+                <w:color w:val="000000"/>
+              </w:rPr>
+              <w:t>100 %</w:t>
+            </w:r>
+          </w:p>
+        </w:tc>
+        <w:tc>
+          <w:tcPr>
+            <w:tcW w:w="2268" w:type="dxa"/>
+          </w:tcPr>
+          <w:p>
+            <w:pPr>
+              <w:rPr>
+                <w:rFonts w:ascii="Verdana" w:hAnsi="Verdana"/>
+                <w:lang w:val="es-EC"/>
+              </w:rPr>
+            </w:pPr>
+            <w:r>
+              <w:rPr>
+                <w:rFonts w:ascii="Verdana" w:hAnsi="Verdana"/>
+                <w:color w:val="000000"/>
+                <w:lang w:val="es-EC"/>
+              </w:rPr>
+              <w:t>Jira, repositorio documental y Git</w:t>
+            </w:r>
+          </w:p>
+        </w:tc>
+        <w:tc>
+          <w:tcPr>
+            <w:tcW w:w="1672" w:type="dxa"/>
+          </w:tcPr>
+          <w:p>
+            <w:pPr>
+              <w:rPr>
+                <w:rFonts w:ascii="Verdana" w:hAnsi="Verdana"/>
+              </w:rPr>
+            </w:pPr>
+            <w:proofErr w:type="spellStart"/>
+            <w:r>
+              <w:rPr>
+                <w:rFonts w:ascii="Verdana" w:hAnsi="Verdana"/>
+                <w:color w:val="000000"/>
+              </w:rPr>
+              <w:t>Seguimiento</w:t>
+            </w:r>
+            <w:proofErr w:type="spellEnd"/>
+            <w:r>
+              <w:rPr>
+                <w:rFonts w:ascii="Verdana" w:hAnsi="Verdana"/>
+                <w:color w:val="000000"/>
+              </w:rPr>
+              <w:t xml:space="preserve"> del </w:t>
+            </w:r>
+            <w:proofErr w:type="spellStart"/>
+            <w:r>
+              <w:rPr>
+                <w:rFonts w:ascii="Verdana" w:hAnsi="Verdana"/>
+                <w:color w:val="000000"/>
+              </w:rPr>
+              <w:t>proyecto</w:t>
+            </w:r>
+            <w:proofErr w:type="spellEnd"/>
+          </w:p>
+        </w:tc>
+      </w:tr>
+      <w:tr>
+        <w:tc>
+          <w:tcPr>
+            <w:tcW w:w="1843" w:type="dxa"/>
+          </w:tcPr>
+          <w:p>
+            <w:pPr>
+              <w:rPr>
+                <w:rFonts w:ascii="Verdana" w:hAnsi="Verdana"/>
+                <w:lang w:val="es-EC"/>
+              </w:rPr>
+            </w:pPr>
+            <w:r>
+              <w:rPr>
+                <w:rFonts w:ascii="Verdana" w:hAnsi="Verdana"/>
+                <w:color w:val="000000"/>
+                <w:lang w:val="es-EC"/>
+              </w:rPr>
+              <w:t>Gestión de riesgos y cambios</w:t>
+            </w:r>
+          </w:p>
+        </w:tc>
+        <w:tc>
+          <w:tcPr>
+            <w:tcW w:w="2801" w:type="dxa"/>
+          </w:tcPr>
+          <w:p>
+            <w:pPr>
+              <w:rPr>
+                <w:rFonts w:ascii="Verdana" w:hAnsi="Verdana"/>
+                <w:lang w:val="es-EC"/>
+              </w:rPr>
+            </w:pPr>
+            <w:r>
+              <w:rPr>
+                <w:rFonts w:ascii="Verdana" w:hAnsi="Verdana"/>
+                <w:color w:val="000000"/>
+                <w:lang w:val="es-EC"/>
+              </w:rPr>
+              <w:t>Verificar que los riesgos y cambios relevantes sean analizados, tratados y documentados.</w:t>
+            </w:r>
+          </w:p>
+        </w:tc>
+        <w:tc>
+          <w:tcPr>
+            <w:tcW w:w="2833" w:type="dxa"/>
+          </w:tcPr>
+          <w:p>
+            <w:pPr>
+              <w:rPr>
+                <w:rFonts w:ascii="Verdana" w:hAnsi="Verdana"/>
+                <w:lang w:val="es-EC"/>
+              </w:rPr>
+            </w:pPr>
+            <w:r>
+              <w:rPr>
+                <w:rFonts w:ascii="Verdana" w:hAnsi="Verdana"/>
+                <w:color w:val="000000"/>
+                <w:lang w:val="es-EC"/>
+              </w:rPr>
+              <w:t>Riesgos y cambios con tratamiento registrado / riesgos y cambios identificados</w:t>
+            </w:r>
+          </w:p>
+        </w:tc>
+        <w:tc>
+          <w:tcPr>
+            <w:tcW w:w="2016" w:type="dxa"/>
+          </w:tcPr>
+          <w:p>
+            <w:pPr>
+              <w:jc w:val="center"/>
+              <w:rPr>
+                <w:rFonts w:ascii="Verdana" w:hAnsi="Verdana"/>
+                <w:lang w:val="es-EC"/>
+              </w:rPr>
+            </w:pPr>
+            <w:r>
+              <w:rPr>
+                <w:rFonts w:ascii="Verdana" w:hAnsi="Verdana"/>
+                <w:color w:val="000000"/>
+                <w:lang w:val="es-EC"/>
+              </w:rPr>
+              <w:t>100 % de elementos altos o críticos y &gt;= 95 % total</w:t>
+            </w:r>
+          </w:p>
+        </w:tc>
+        <w:tc>
+          <w:tcPr>
+            <w:tcW w:w="2268" w:type="dxa"/>
+          </w:tcPr>
+          <w:p>
+            <w:pPr>
+              <w:rPr>
+                <w:rFonts w:ascii="Verdana" w:hAnsi="Verdana"/>
+                <w:lang w:val="es-EC"/>
+              </w:rPr>
+            </w:pPr>
+            <w:r>
+              <w:rPr>
+                <w:rFonts w:ascii="Verdana" w:hAnsi="Verdana"/>
+                <w:color w:val="000000"/>
+                <w:lang w:val="es-EC"/>
+              </w:rPr>
+              <w:t>Matriz de riesgos y registro de gestión de cambios</w:t>
+            </w:r>
+          </w:p>
+        </w:tc>
+        <w:tc>
+          <w:tcPr>
+            <w:tcW w:w="1672" w:type="dxa"/>
+          </w:tcPr>
+          <w:p>
+            <w:pPr>
+              <w:rPr>
+                <w:rFonts w:ascii="Verdana" w:hAnsi="Verdana"/>
+                <w:lang w:val="es-EC"/>
+              </w:rPr>
+            </w:pPr>
+            <w:r>
+              <w:rPr>
+                <w:rFonts w:ascii="Verdana" w:hAnsi="Verdana"/>
+                <w:color w:val="000000"/>
+                <w:lang w:val="es-EC"/>
+              </w:rPr>
+              <w:t>Gestión de riesgos y cambios</w:t>
+            </w:r>
+          </w:p>
+        </w:tc>
+      </w:tr>
+      <w:tr>
+        <w:tc>
+          <w:tcPr>
+            <w:tcW w:w="1843" w:type="dxa"/>
+          </w:tcPr>
+          <w:p>
+            <w:pPr>
+              <w:rPr>
+                <w:rFonts w:ascii="Verdana" w:hAnsi="Verdana"/>
+              </w:rPr>
+            </w:pPr>
+            <w:proofErr w:type="spellStart"/>
+            <w:r>
+              <w:rPr>
+                <w:rFonts w:ascii="Verdana" w:hAnsi="Verdana"/>
+                <w:color w:val="000000"/>
+              </w:rPr>
+              <w:t>Aceptación</w:t>
+            </w:r>
+            <w:proofErr w:type="spellEnd"/>
+            <w:r>
+              <w:rPr>
+                <w:rFonts w:ascii="Verdana" w:hAnsi="Verdana"/>
+                <w:color w:val="000000"/>
+              </w:rPr>
+              <w:t xml:space="preserve"> de </w:t>
+            </w:r>
+            <w:proofErr w:type="spellStart"/>
+            <w:r>
+              <w:rPr>
+                <w:rFonts w:ascii="Verdana" w:hAnsi="Verdana"/>
+                <w:color w:val="000000"/>
+              </w:rPr>
+              <w:t>entregables</w:t>
+            </w:r>
+            <w:proofErr w:type="spellEnd"/>
+          </w:p>
+        </w:tc>
+        <w:tc>
+          <w:tcPr>
+            <w:tcW w:w="2801" w:type="dxa"/>
+          </w:tcPr>
+          <w:p>
+            <w:pPr>
+              <w:rPr>
+                <w:rFonts w:ascii="Verdana" w:hAnsi="Verdana"/>
+                <w:lang w:val="es-EC"/>
+              </w:rPr>
+            </w:pPr>
+            <w:r>
+              <w:rPr>
+                <w:rFonts w:ascii="Verdana" w:hAnsi="Verdana"/>
+                <w:color w:val="000000"/>
+                <w:lang w:val="es-EC"/>
+              </w:rPr>
+              <w:t>Medir la aceptación de los resultados revisados por el Product Owner y la patrocinadora académica.</w:t>
+            </w:r>
+          </w:p>
+        </w:tc>
+        <w:tc>
+          <w:tcPr>
+            <w:tcW w:w="2833" w:type="dxa"/>
+          </w:tcPr>
+          <w:p>
+            <w:pPr>
+              <w:rPr>
+                <w:rFonts w:ascii="Verdana" w:hAnsi="Verdana"/>
+              </w:rPr>
+            </w:pPr>
+            <w:proofErr w:type="spellStart"/>
+            <w:r>
+              <w:rPr>
+                <w:rFonts w:ascii="Verdana" w:hAnsi="Verdana"/>
+                <w:color w:val="000000"/>
+              </w:rPr>
+              <w:t>Entregables</w:t>
+            </w:r>
+            <w:proofErr w:type="spellEnd"/>
+            <w:r>
+              <w:rPr>
+                <w:rFonts w:ascii="Verdana" w:hAnsi="Verdana"/>
+                <w:color w:val="000000"/>
+              </w:rPr>
+              <w:t xml:space="preserve"> </w:t>
+            </w:r>
+            <w:proofErr w:type="spellStart"/>
+            <w:r>
+              <w:rPr>
+                <w:rFonts w:ascii="Verdana" w:hAnsi="Verdana"/>
+                <w:color w:val="000000"/>
+              </w:rPr>
+              <w:t>aceptados</w:t>
+            </w:r>
+            <w:proofErr w:type="spellEnd"/>
+            <w:r>
+              <w:rPr>
+                <w:rFonts w:ascii="Verdana" w:hAnsi="Verdana"/>
+                <w:color w:val="000000"/>
+              </w:rPr>
+              <w:t xml:space="preserve"> / </w:t>
+            </w:r>
+            <w:proofErr w:type="spellStart"/>
+            <w:r>
+              <w:rPr>
+                <w:rFonts w:ascii="Verdana" w:hAnsi="Verdana"/>
+                <w:color w:val="000000"/>
+              </w:rPr>
+              <w:t>entregables</w:t>
+            </w:r>
+            <w:proofErr w:type="spellEnd"/>
+            <w:r>
+              <w:rPr>
+                <w:rFonts w:ascii="Verdana" w:hAnsi="Verdana"/>
+                <w:color w:val="000000"/>
+              </w:rPr>
+              <w:t xml:space="preserve"> presentados</w:t>
+            </w:r>
+          </w:p>
+        </w:tc>
+        <w:tc>
+          <w:tcPr>
+            <w:tcW w:w="2016" w:type="dxa"/>
+          </w:tcPr>
+          <w:p>
+            <w:pPr>
+              <w:jc w:val="center"/>
+              <w:rPr>
+                <w:rFonts w:ascii="Verdana" w:hAnsi="Verdana"/>
+              </w:rPr>
+            </w:pPr>
+            <w:r>
+              <w:rPr>
+                <w:rFonts w:ascii="Verdana" w:hAnsi="Verdana"/>
+                <w:color w:val="000000"/>
+              </w:rPr>
+              <w:t>&gt;= 90 %</w:t>
+            </w:r>
+          </w:p>
+        </w:tc>
+        <w:tc>
+          <w:tcPr>
+            <w:tcW w:w="2268" w:type="dxa"/>
+          </w:tcPr>
+          <w:p>
+            <w:pPr>
+              <w:rPr>
+                <w:rFonts w:ascii="Verdana" w:hAnsi="Verdana"/>
+                <w:lang w:val="es-EC"/>
+              </w:rPr>
+            </w:pPr>
+            <w:r>
+              <w:rPr>
+                <w:rFonts w:ascii="Verdana" w:hAnsi="Verdana"/>
+                <w:color w:val="000000"/>
+                <w:lang w:val="es-EC"/>
+              </w:rPr>
+              <w:t>Actas, revisiones, Jira y registros de aprobación</w:t>
+            </w:r>
+          </w:p>
+        </w:tc>
+        <w:tc>
+          <w:tcPr>
+            <w:tcW w:w="1672" w:type="dxa"/>
+          </w:tcPr>
+          <w:p>
+            <w:pPr>
+              <w:rPr>
+                <w:rFonts w:ascii="Verdana" w:hAnsi="Verdana"/>
+              </w:rPr>
+            </w:pPr>
+            <w:proofErr w:type="spellStart"/>
+            <w:r>
+              <w:rPr>
+                <w:rFonts w:ascii="Verdana" w:hAnsi="Verdana"/>
+                <w:color w:val="000000"/>
+              </w:rPr>
+              <w:t>Validación</w:t>
+            </w:r>
+            <w:proofErr w:type="spellEnd"/>
+            <w:r>
+              <w:rPr>
+                <w:rFonts w:ascii="Verdana" w:hAnsi="Verdana"/>
+                <w:color w:val="000000"/>
+              </w:rPr>
+              <w:t xml:space="preserve"> y </w:t>
+            </w:r>
+            <w:proofErr w:type="spellStart"/>
+            <w:r>
+              <w:rPr>
+                <w:rFonts w:ascii="Verdana" w:hAnsi="Verdana"/>
+                <w:color w:val="000000"/>
+              </w:rPr>
+              <w:t>aceptación</w:t>
+            </w:r>
+            <w:proofErr w:type="spellEnd"/>
           </w:p>
         </w:tc>
       </w:tr>
@@ -22320,10 +25367,9 @@
       </w:pPr>
       <w:r>
         <w:rPr>
-          <w:rFonts w:ascii="Verdana" w:hAnsi="Verdana" w:cs="Times New Roman"/>
           <w:lang w:val="es-EC"/>
         </w:rPr>
-        <w:t>Para la ejecución de seguimiento se utilizará la matriz de seguimiento generada en Excel.</w:t>
+        <w:t>Para la ejecución y el seguimiento se utilizará el archivo Excel asociado. La hoja “Métricas de calidad” consolida los indicadores de proyecto definidos en la sección 3.8, mientras que la hoja “Matriz de calidad” conserva los controles operativos, resultados, evidencias, observaciones y acciones correctivas.</w:t>
       </w:r>
     </w:p>
     <w:sectPr>
@@ -27978,6 +31024,7 @@
   <w:style w:type="character" w:default="1" w:styleId="Fuentedeprrafopredeter">
     <w:name w:val="Default Paragraph Font"/>
     <w:uiPriority w:val="1"/>
+    <w:semiHidden/>
     <w:unhideWhenUsed/>
   </w:style>
   <w:style w:type="table" w:default="1" w:styleId="Tablanormal">

</xml_diff>